<commit_message>
Update project report with observability features
</commit_message>
<xml_diff>
--- a/VideoTutor_Project_Report.docx
+++ b/VideoTutor_Project_Report.docx
@@ -27,18 +27,21 @@
         <w:spacing w:after="800"/>
         <w:jc w:val="center"/>
         <w:rPr>
-          <w:sz w:val="24"/>
-          <w:szCs w:val="24"/>
-        </w:rPr>
-      </w:pPr>
-      <w:r>
-        <w:rPr>
           <w:i/>
           <w:iCs/>
           <w:color w:val="000000"/>
           <w:sz w:val="24"/>
           <w:szCs w:val="24"/>
         </w:rPr>
+      </w:pPr>
+      <w:r>
+        <w:rPr>
+          <w:i/>
+          <w:iCs/>
+          <w:color w:val="000000"/>
+          <w:sz w:val="24"/>
+          <w:szCs w:val="24"/>
+        </w:rPr>
         <w:t>An AI-Powered Video Learning and Study Assistant</w:t>
       </w:r>
     </w:p>
@@ -87,7 +90,7 @@
         <w:pStyle w:val="ListParagraph"/>
         <w:numPr>
           <w:ilvl w:val="0"/>
-          <w:numId w:val="1"/>
+          <w:numId w:val="3"/>
         </w:numPr>
         <w:spacing w:after="120" w:line="300" w:lineRule="auto"/>
         <w:jc w:val="both"/>
@@ -106,7 +109,7 @@
         <w:pStyle w:val="ListParagraph"/>
         <w:numPr>
           <w:ilvl w:val="0"/>
-          <w:numId w:val="1"/>
+          <w:numId w:val="3"/>
         </w:numPr>
         <w:spacing w:after="120" w:line="300" w:lineRule="auto"/>
         <w:jc w:val="both"/>
@@ -125,7 +128,7 @@
         <w:pStyle w:val="ListParagraph"/>
         <w:numPr>
           <w:ilvl w:val="0"/>
-          <w:numId w:val="1"/>
+          <w:numId w:val="3"/>
         </w:numPr>
         <w:spacing w:after="120" w:line="300" w:lineRule="auto"/>
         <w:jc w:val="both"/>
@@ -136,7 +139,7 @@
           <w:sz w:val="24"/>
           <w:szCs w:val="24"/>
         </w:rPr>
-        <w:t>Solution: transcript is chunked, embedded, and stored in a vector database; an AI agent retrieves relevant chunks before answering, and cites exact timestamps.</w:t>
+        <w:t>Solution: the transcript is chunked, embedded, and stored in a vector database; an AI agent retrieves relevant chunks before answering, and cites exact timestamps.</w:t>
       </w:r>
     </w:p>
     <w:p>
@@ -144,7 +147,7 @@
         <w:pStyle w:val="ListParagraph"/>
         <w:numPr>
           <w:ilvl w:val="0"/>
-          <w:numId w:val="1"/>
+          <w:numId w:val="3"/>
         </w:numPr>
         <w:spacing w:after="120" w:line="300" w:lineRule="auto"/>
         <w:jc w:val="both"/>
@@ -179,7 +182,7 @@
         <w:pStyle w:val="ListParagraph"/>
         <w:numPr>
           <w:ilvl w:val="0"/>
-          <w:numId w:val="1"/>
+          <w:numId w:val="3"/>
         </w:numPr>
         <w:spacing w:after="120" w:line="300" w:lineRule="auto"/>
         <w:jc w:val="both"/>
@@ -198,7 +201,7 @@
         <w:pStyle w:val="ListParagraph"/>
         <w:numPr>
           <w:ilvl w:val="0"/>
-          <w:numId w:val="1"/>
+          <w:numId w:val="3"/>
         </w:numPr>
         <w:spacing w:after="120" w:line="300" w:lineRule="auto"/>
         <w:jc w:val="both"/>
@@ -217,7 +220,7 @@
         <w:pStyle w:val="ListParagraph"/>
         <w:numPr>
           <w:ilvl w:val="0"/>
-          <w:numId w:val="1"/>
+          <w:numId w:val="3"/>
         </w:numPr>
         <w:spacing w:after="120" w:line="300" w:lineRule="auto"/>
         <w:jc w:val="both"/>
@@ -236,7 +239,7 @@
         <w:pStyle w:val="ListParagraph"/>
         <w:numPr>
           <w:ilvl w:val="0"/>
-          <w:numId w:val="1"/>
+          <w:numId w:val="3"/>
         </w:numPr>
         <w:spacing w:after="120" w:line="300" w:lineRule="auto"/>
         <w:jc w:val="both"/>
@@ -247,7 +250,42 @@
           <w:sz w:val="24"/>
           <w:szCs w:val="24"/>
         </w:rPr>
-        <w:t>Keep a human reviewer in control of AI-generated notes via approval/revision before finalising.</w:t>
+        <w:t>Keep a human reviewer in control of AI-generated notes via approval and revision before finalising.</w:t>
+      </w:r>
+    </w:p>
+    <w:p>
+      <w:pPr>
+        <w:pStyle w:val="ListParagraph"/>
+        <w:numPr>
+          <w:ilvl w:val="0"/>
+          <w:numId w:val="3"/>
+        </w:numPr>
+        <w:spacing w:after="120" w:line="300" w:lineRule="auto"/>
+        <w:jc w:val="both"/>
+      </w:pPr>
+      <w:r>
+        <w:rPr>
+          <w:color w:val="000000"/>
+          <w:sz w:val="24"/>
+          <w:szCs w:val="24"/>
+        </w:rPr>
+        <w:t xml:space="preserve">Provide real-time observability over AI operations </w:t>
+      </w:r>
+      <w:r>
+        <w:rPr>
+          <w:color w:val="000000"/>
+          <w:sz w:val="24"/>
+          <w:szCs w:val="24"/>
+        </w:rPr>
+        <w:t xml:space="preserve">- </w:t>
+      </w:r>
+      <w:r>
+        <w:rPr>
+          <w:color w:val="000000"/>
+          <w:sz w:val="24"/>
+          <w:szCs w:val="24"/>
+        </w:rPr>
+        <w:t>tracking safety, cost, and token latency without relying on third-party tracking services.</w:t>
       </w:r>
     </w:p>
     <w:p>
@@ -277,7 +315,7 @@
           <w:sz w:val="24"/>
           <w:szCs w:val="24"/>
         </w:rPr>
-        <w:t xml:space="preserve">Five layers, each with one responsibility: React frontend for UI, </w:t>
+        <w:t xml:space="preserve">Six layers, each with one responsibility: React frontend for the UI, </w:t>
       </w:r>
       <w:proofErr w:type="spellStart"/>
       <w:r>
@@ -313,7 +351,16 @@
           <w:sz w:val="24"/>
           <w:szCs w:val="24"/>
         </w:rPr>
-        <w:t xml:space="preserve"> agent for decision-making, an MCP-style tool layer for actions, and the storage layer (YouTube transcript service + </w:t>
+        <w:t xml:space="preserve"> agent for decision-making, an MCP-style tool layer for actions, a telemetry </w:t>
+      </w:r>
+      <w:r>
+        <w:rPr>
+          <w:color w:val="000000"/>
+          <w:sz w:val="24"/>
+          <w:szCs w:val="24"/>
+        </w:rPr>
+        <w:lastRenderedPageBreak/>
+        <w:t xml:space="preserve">and observability layer for monitoring, and the storage layer (YouTube transcript service and </w:t>
       </w:r>
       <w:proofErr w:type="spellStart"/>
       <w:r>
@@ -343,10 +390,9 @@
         <w:rPr>
           <w:noProof/>
         </w:rPr>
-        <w:lastRenderedPageBreak/>
         <w:drawing>
-          <wp:inline distT="0" distB="0" distL="0" distR="0" wp14:anchorId="73A8D6AD" wp14:editId="72F953F8">
-            <wp:extent cx="5734050" cy="3930650"/>
+          <wp:inline distT="0" distB="0" distL="0" distR="0" wp14:anchorId="35613671" wp14:editId="176EFD85">
+            <wp:extent cx="6064250" cy="3282950"/>
             <wp:effectExtent l="0" t="0" r="0" b="0"/>
             <wp:docPr id="1" name="Picture 1"/>
             <wp:cNvGraphicFramePr>
@@ -361,9 +407,9 @@
                       <a:picLocks noChangeAspect="1" noChangeArrowheads="1"/>
                     </pic:cNvPicPr>
                   </pic:nvPicPr>
-                  <pic:blipFill>
+                  <pic:blipFill rotWithShape="1">
                     <a:blip r:embed="rId7"/>
-                    <a:srcRect/>
+                    <a:srcRect b="12963"/>
                     <a:stretch>
                       <a:fillRect/>
                     </a:stretch>
@@ -371,11 +417,19 @@
                   <pic:spPr bwMode="auto">
                     <a:xfrm>
                       <a:off x="0" y="0"/>
-                      <a:ext cx="5734050" cy="3930650"/>
+                      <a:ext cx="6064250" cy="3282950"/>
                     </a:xfrm>
                     <a:prstGeom prst="rect">
                       <a:avLst/>
                     </a:prstGeom>
+                    <a:ln>
+                      <a:noFill/>
+                    </a:ln>
+                    <a:extLst>
+                      <a:ext uri="{53640926-AAD7-44D8-BBD7-CCE9431645EC}">
+                        <a14:shadowObscured xmlns:a14="http://schemas.microsoft.com/office/drawing/2010/main"/>
+                      </a:ext>
+                    </a:extLst>
                   </pic:spPr>
                 </pic:pic>
               </a:graphicData>
@@ -388,20 +442,28 @@
       <w:pPr>
         <w:spacing w:before="120" w:after="300"/>
         <w:jc w:val="center"/>
-      </w:pPr>
-      <w:r>
-        <w:rPr>
+        <w:rPr>
+          <w:b/>
+          <w:bCs/>
+        </w:rPr>
+      </w:pPr>
+      <w:r>
+        <w:rPr>
+          <w:b/>
+          <w:bCs/>
           <w:i/>
           <w:iCs/>
           <w:color w:val="000000"/>
           <w:sz w:val="22"/>
           <w:szCs w:val="22"/>
         </w:rPr>
-        <w:t xml:space="preserve">Figure 1: </w:t>
+        <w:t xml:space="preserve">          Figure 1: </w:t>
       </w:r>
       <w:proofErr w:type="spellStart"/>
       <w:r>
         <w:rPr>
+          <w:b/>
+          <w:bCs/>
           <w:i/>
           <w:iCs/>
           <w:color w:val="000000"/>
@@ -413,6 +475,8 @@
       <w:proofErr w:type="spellEnd"/>
       <w:r>
         <w:rPr>
+          <w:b/>
+          <w:bCs/>
           <w:i/>
           <w:iCs/>
           <w:color w:val="000000"/>
@@ -478,16 +542,19 @@
         <w:tc>
           <w:tcPr>
             <w:tcW w:w="2000" w:type="dxa"/>
-            <w:shd w:val="clear" w:color="auto" w:fill="D9D9D9"/>
-            <w:tcMar>
-              <w:top w:w="80" w:type="dxa"/>
-              <w:left w:w="100" w:type="dxa"/>
-              <w:bottom w:w="80" w:type="dxa"/>
-              <w:right w:w="100" w:type="dxa"/>
-            </w:tcMar>
-            <w:vAlign w:val="center"/>
-          </w:tcPr>
-          <w:p>
+            <w:shd w:val="clear" w:color="auto" w:fill="FFFFFF" w:themeFill="background1"/>
+            <w:tcMar>
+              <w:top w:w="80" w:type="dxa"/>
+              <w:left w:w="100" w:type="dxa"/>
+              <w:bottom w:w="80" w:type="dxa"/>
+              <w:right w:w="100" w:type="dxa"/>
+            </w:tcMar>
+            <w:vAlign w:val="center"/>
+          </w:tcPr>
+          <w:p>
+            <w:pPr>
+              <w:jc w:val="center"/>
+            </w:pPr>
             <w:r>
               <w:rPr>
                 <w:b/>
@@ -501,16 +568,19 @@
         <w:tc>
           <w:tcPr>
             <w:tcW w:w="2600" w:type="dxa"/>
-            <w:shd w:val="clear" w:color="auto" w:fill="D9D9D9"/>
-            <w:tcMar>
-              <w:top w:w="80" w:type="dxa"/>
-              <w:left w:w="100" w:type="dxa"/>
-              <w:bottom w:w="80" w:type="dxa"/>
-              <w:right w:w="100" w:type="dxa"/>
-            </w:tcMar>
-            <w:vAlign w:val="center"/>
-          </w:tcPr>
-          <w:p>
+            <w:shd w:val="clear" w:color="auto" w:fill="FFFFFF" w:themeFill="background1"/>
+            <w:tcMar>
+              <w:top w:w="80" w:type="dxa"/>
+              <w:left w:w="100" w:type="dxa"/>
+              <w:bottom w:w="80" w:type="dxa"/>
+              <w:right w:w="100" w:type="dxa"/>
+            </w:tcMar>
+            <w:vAlign w:val="center"/>
+          </w:tcPr>
+          <w:p>
+            <w:pPr>
+              <w:jc w:val="center"/>
+            </w:pPr>
             <w:r>
               <w:rPr>
                 <w:b/>
@@ -524,16 +594,19 @@
         <w:tc>
           <w:tcPr>
             <w:tcW w:w="4900" w:type="dxa"/>
-            <w:shd w:val="clear" w:color="auto" w:fill="D9D9D9"/>
-            <w:tcMar>
-              <w:top w:w="80" w:type="dxa"/>
-              <w:left w:w="100" w:type="dxa"/>
-              <w:bottom w:w="80" w:type="dxa"/>
-              <w:right w:w="100" w:type="dxa"/>
-            </w:tcMar>
-            <w:vAlign w:val="center"/>
-          </w:tcPr>
-          <w:p>
+            <w:shd w:val="clear" w:color="auto" w:fill="FFFFFF" w:themeFill="background1"/>
+            <w:tcMar>
+              <w:top w:w="80" w:type="dxa"/>
+              <w:left w:w="100" w:type="dxa"/>
+              <w:bottom w:w="80" w:type="dxa"/>
+              <w:right w:w="100" w:type="dxa"/>
+            </w:tcMar>
+            <w:vAlign w:val="center"/>
+          </w:tcPr>
+          <w:p>
+            <w:pPr>
+              <w:jc w:val="center"/>
+            </w:pPr>
             <w:r>
               <w:rPr>
                 <w:b/>
@@ -686,7 +759,7 @@
               <w:rPr>
                 <w:color w:val="000000"/>
               </w:rPr>
-              <w:t xml:space="preserve"> key is missing/unavailable</w:t>
+              <w:t xml:space="preserve"> key is missing or unavailable</w:t>
             </w:r>
           </w:p>
         </w:tc>
@@ -748,7 +821,7 @@
               <w:rPr>
                 <w:color w:val="000000"/>
               </w:rPr>
-              <w:t>Second fallback if Gemini also unavailable</w:t>
+              <w:t>Second fallback if Gemini is also unavailable</w:t>
             </w:r>
           </w:p>
         </w:tc>
@@ -1356,7 +1429,7 @@
         <w:pStyle w:val="ListParagraph"/>
         <w:numPr>
           <w:ilvl w:val="0"/>
-          <w:numId w:val="1"/>
+          <w:numId w:val="3"/>
         </w:numPr>
         <w:spacing w:after="120" w:line="300" w:lineRule="auto"/>
         <w:jc w:val="both"/>
@@ -1367,7 +1440,23 @@
           <w:sz w:val="24"/>
           <w:szCs w:val="24"/>
         </w:rPr>
-        <w:t>URL accepted in any format: watch link, youtu.be, embed, shorts — normalised to an 11-character video ID.</w:t>
+        <w:t xml:space="preserve">URL accepted in any format: watch link, youtu.be, embed, shorts </w:t>
+      </w:r>
+      <w:r>
+        <w:rPr>
+          <w:color w:val="000000"/>
+          <w:sz w:val="24"/>
+          <w:szCs w:val="24"/>
+        </w:rPr>
+        <w:t>-</w:t>
+      </w:r>
+      <w:r>
+        <w:rPr>
+          <w:color w:val="000000"/>
+          <w:sz w:val="24"/>
+          <w:szCs w:val="24"/>
+        </w:rPr>
+        <w:t xml:space="preserve"> normalised to an 11-character video ID. The system validates that the video is educational or learning content, rejecting non-educational videos to keep the tool focused.</w:t>
       </w:r>
     </w:p>
     <w:p>
@@ -1375,7 +1464,7 @@
         <w:pStyle w:val="ListParagraph"/>
         <w:numPr>
           <w:ilvl w:val="0"/>
-          <w:numId w:val="1"/>
+          <w:numId w:val="3"/>
         </w:numPr>
         <w:spacing w:after="120" w:line="300" w:lineRule="auto"/>
         <w:jc w:val="both"/>
@@ -1430,7 +1519,7 @@
         <w:pStyle w:val="ListParagraph"/>
         <w:numPr>
           <w:ilvl w:val="0"/>
-          <w:numId w:val="1"/>
+          <w:numId w:val="3"/>
         </w:numPr>
         <w:spacing w:after="120" w:line="300" w:lineRule="auto"/>
         <w:jc w:val="both"/>
@@ -1441,7 +1530,23 @@
           <w:sz w:val="24"/>
           <w:szCs w:val="24"/>
         </w:rPr>
-        <w:t>Small caption fragments merged into ~1000-character chunks (~1.5 min of speech) — too-short fragments give poor search results on their own.</w:t>
+        <w:t xml:space="preserve">Small caption fragments merged into ~1000-character chunks (~1.5 min of speech) </w:t>
+      </w:r>
+      <w:r>
+        <w:rPr>
+          <w:color w:val="000000"/>
+          <w:sz w:val="24"/>
+          <w:szCs w:val="24"/>
+        </w:rPr>
+        <w:t xml:space="preserve">- </w:t>
+      </w:r>
+      <w:r>
+        <w:rPr>
+          <w:color w:val="000000"/>
+          <w:sz w:val="24"/>
+          <w:szCs w:val="24"/>
+        </w:rPr>
+        <w:t>too-short fragments give poor search results on their own.</w:t>
       </w:r>
     </w:p>
     <w:p>
@@ -1449,7 +1554,7 @@
         <w:pStyle w:val="ListParagraph"/>
         <w:numPr>
           <w:ilvl w:val="0"/>
-          <w:numId w:val="1"/>
+          <w:numId w:val="3"/>
         </w:numPr>
         <w:spacing w:after="120" w:line="300" w:lineRule="auto"/>
         <w:jc w:val="both"/>
@@ -1468,7 +1573,7 @@
         <w:pStyle w:val="ListParagraph"/>
         <w:numPr>
           <w:ilvl w:val="0"/>
-          <w:numId w:val="1"/>
+          <w:numId w:val="3"/>
         </w:numPr>
         <w:spacing w:after="120" w:line="300" w:lineRule="auto"/>
         <w:jc w:val="both"/>
@@ -1479,7 +1584,23 @@
           <w:sz w:val="24"/>
           <w:szCs w:val="24"/>
         </w:rPr>
-        <w:t>Each chunk stores: text, start time, end time, video ID, chunk index — used later for clickable timestamp links.</w:t>
+        <w:t xml:space="preserve">Each chunk stores: text, start time, end time, video ID, chunk index </w:t>
+      </w:r>
+      <w:r>
+        <w:rPr>
+          <w:color w:val="000000"/>
+          <w:sz w:val="24"/>
+          <w:szCs w:val="24"/>
+        </w:rPr>
+        <w:t xml:space="preserve">- </w:t>
+      </w:r>
+      <w:r>
+        <w:rPr>
+          <w:color w:val="000000"/>
+          <w:sz w:val="24"/>
+          <w:szCs w:val="24"/>
+        </w:rPr>
+        <w:t>used later for clickable timestamp links.</w:t>
       </w:r>
     </w:p>
     <w:p>
@@ -1503,7 +1624,7 @@
         <w:pStyle w:val="ListParagraph"/>
         <w:numPr>
           <w:ilvl w:val="0"/>
-          <w:numId w:val="1"/>
+          <w:numId w:val="3"/>
         </w:numPr>
         <w:spacing w:after="120" w:line="300" w:lineRule="auto"/>
         <w:jc w:val="both"/>
@@ -1558,7 +1679,7 @@
         <w:pStyle w:val="ListParagraph"/>
         <w:numPr>
           <w:ilvl w:val="0"/>
-          <w:numId w:val="1"/>
+          <w:numId w:val="3"/>
         </w:numPr>
         <w:spacing w:after="120" w:line="300" w:lineRule="auto"/>
         <w:jc w:val="both"/>
@@ -1595,7 +1716,7 @@
         <w:pStyle w:val="ListParagraph"/>
         <w:numPr>
           <w:ilvl w:val="0"/>
-          <w:numId w:val="1"/>
+          <w:numId w:val="3"/>
         </w:numPr>
         <w:spacing w:after="120" w:line="300" w:lineRule="auto"/>
         <w:jc w:val="both"/>
@@ -1606,7 +1727,25 @@
           <w:sz w:val="24"/>
           <w:szCs w:val="24"/>
         </w:rPr>
-        <w:t>Relevance threshold = 1.65 (distance). Below this = real match; above = topic is treated as not in this video.</w:t>
+        <w:t xml:space="preserve">Relevance threshold = 1.65 (distance). Below </w:t>
+      </w:r>
+      <w:proofErr w:type="gramStart"/>
+      <w:r>
+        <w:rPr>
+          <w:color w:val="000000"/>
+          <w:sz w:val="24"/>
+          <w:szCs w:val="24"/>
+        </w:rPr>
+        <w:t>this counts</w:t>
+      </w:r>
+      <w:proofErr w:type="gramEnd"/>
+      <w:r>
+        <w:rPr>
+          <w:color w:val="000000"/>
+          <w:sz w:val="24"/>
+          <w:szCs w:val="24"/>
+        </w:rPr>
+        <w:t xml:space="preserve"> as a real match; above it, the topic is treated as not present in this video.</w:t>
       </w:r>
     </w:p>
     <w:p>
@@ -1614,7 +1753,7 @@
         <w:pStyle w:val="ListParagraph"/>
         <w:numPr>
           <w:ilvl w:val="0"/>
-          <w:numId w:val="1"/>
+          <w:numId w:val="3"/>
         </w:numPr>
         <w:spacing w:after="120" w:line="300" w:lineRule="auto"/>
         <w:jc w:val="both"/>
@@ -1627,6 +1766,30 @@
         </w:rPr>
         <w:t>Concurrent-insert protection: a per-video lock prevents duplicate indexing if two requests process the same video at once.</w:t>
       </w:r>
+    </w:p>
+    <w:p>
+      <w:pPr>
+        <w:pStyle w:val="ListParagraph"/>
+        <w:spacing w:after="120" w:line="300" w:lineRule="auto"/>
+        <w:ind w:left="720"/>
+        <w:jc w:val="both"/>
+      </w:pPr>
+    </w:p>
+    <w:p>
+      <w:pPr>
+        <w:pStyle w:val="ListParagraph"/>
+        <w:spacing w:after="120" w:line="300" w:lineRule="auto"/>
+        <w:ind w:left="720"/>
+        <w:jc w:val="both"/>
+      </w:pPr>
+    </w:p>
+    <w:p>
+      <w:pPr>
+        <w:pStyle w:val="ListParagraph"/>
+        <w:spacing w:after="120" w:line="300" w:lineRule="auto"/>
+        <w:ind w:left="720"/>
+        <w:jc w:val="both"/>
+      </w:pPr>
     </w:p>
     <w:p>
       <w:pPr>
@@ -1641,6 +1804,7 @@
           <w:sz w:val="30"/>
           <w:szCs w:val="30"/>
         </w:rPr>
+        <w:lastRenderedPageBreak/>
         <w:t xml:space="preserve">7. </w:t>
       </w:r>
       <w:proofErr w:type="spellStart"/>
@@ -1721,7 +1885,7 @@
         <w:pStyle w:val="ListParagraph"/>
         <w:numPr>
           <w:ilvl w:val="0"/>
-          <w:numId w:val="1"/>
+          <w:numId w:val="3"/>
         </w:numPr>
         <w:spacing w:after="120" w:line="300" w:lineRule="auto"/>
         <w:jc w:val="both"/>
@@ -1778,7 +1942,23 @@
           <w:sz w:val="24"/>
           <w:szCs w:val="24"/>
         </w:rPr>
-        <w:t xml:space="preserve"> — identifies and tracks the active video.</w:t>
+        <w:t xml:space="preserve"> </w:t>
+      </w:r>
+      <w:r>
+        <w:rPr>
+          <w:color w:val="000000"/>
+          <w:sz w:val="24"/>
+          <w:szCs w:val="24"/>
+        </w:rPr>
+        <w:t>-</w:t>
+      </w:r>
+      <w:r>
+        <w:rPr>
+          <w:color w:val="000000"/>
+          <w:sz w:val="24"/>
+          <w:szCs w:val="24"/>
+        </w:rPr>
+        <w:t xml:space="preserve"> identifies and tracks the active video.</w:t>
       </w:r>
     </w:p>
     <w:p>
@@ -1786,7 +1966,7 @@
         <w:pStyle w:val="ListParagraph"/>
         <w:numPr>
           <w:ilvl w:val="0"/>
-          <w:numId w:val="1"/>
+          <w:numId w:val="3"/>
         </w:numPr>
         <w:spacing w:after="120" w:line="300" w:lineRule="auto"/>
         <w:jc w:val="both"/>
@@ -1797,8 +1977,23 @@
           <w:sz w:val="24"/>
           <w:szCs w:val="24"/>
         </w:rPr>
-        <w:lastRenderedPageBreak/>
-        <w:t>messages — full chat history; uses an accumulating reducer (</w:t>
+        <w:t xml:space="preserve">messages </w:t>
+      </w:r>
+      <w:r>
+        <w:rPr>
+          <w:color w:val="000000"/>
+          <w:sz w:val="24"/>
+          <w:szCs w:val="24"/>
+        </w:rPr>
+        <w:t>-</w:t>
+      </w:r>
+      <w:r>
+        <w:rPr>
+          <w:color w:val="000000"/>
+          <w:sz w:val="24"/>
+          <w:szCs w:val="24"/>
+        </w:rPr>
+        <w:t xml:space="preserve"> full chat history; uses an accumulating reducer (</w:t>
       </w:r>
       <w:proofErr w:type="spellStart"/>
       <w:r>
@@ -1824,7 +2019,7 @@
         <w:pStyle w:val="ListParagraph"/>
         <w:numPr>
           <w:ilvl w:val="0"/>
-          <w:numId w:val="1"/>
+          <w:numId w:val="3"/>
         </w:numPr>
         <w:spacing w:after="120" w:line="300" w:lineRule="auto"/>
         <w:jc w:val="both"/>
@@ -1899,7 +2094,23 @@
           <w:sz w:val="24"/>
           <w:szCs w:val="24"/>
         </w:rPr>
-        <w:t xml:space="preserve"> — updated per turn.</w:t>
+        <w:t xml:space="preserve"> </w:t>
+      </w:r>
+      <w:r>
+        <w:rPr>
+          <w:color w:val="000000"/>
+          <w:sz w:val="24"/>
+          <w:szCs w:val="24"/>
+        </w:rPr>
+        <w:t>-</w:t>
+      </w:r>
+      <w:r>
+        <w:rPr>
+          <w:color w:val="000000"/>
+          <w:sz w:val="24"/>
+          <w:szCs w:val="24"/>
+        </w:rPr>
+        <w:t>updated per turn.</w:t>
       </w:r>
     </w:p>
     <w:p>
@@ -1912,10 +2123,10 @@
           <w:noProof/>
         </w:rPr>
         <w:drawing>
-          <wp:inline distT="0" distB="0" distL="0" distR="0" wp14:anchorId="5FFD1750" wp14:editId="47D9259A">
-            <wp:extent cx="5022850" cy="3930650"/>
-            <wp:effectExtent l="0" t="0" r="6350" b="0"/>
-            <wp:docPr id="2133209650" name="Picture 2133209650"/>
+          <wp:inline distT="0" distB="0" distL="0" distR="0" wp14:anchorId="590488F2" wp14:editId="2DEDFE32">
+            <wp:extent cx="5873750" cy="4000500"/>
+            <wp:effectExtent l="0" t="0" r="0" b="0"/>
+            <wp:docPr id="394980428" name="Picture 394980428"/>
             <wp:cNvGraphicFramePr>
               <a:graphicFrameLocks xmlns:a="http://schemas.openxmlformats.org/drawingml/2006/main" noChangeAspect="1"/>
             </wp:cNvGraphicFramePr>
@@ -1928,9 +2139,9 @@
                       <a:picLocks noChangeAspect="1" noChangeArrowheads="1"/>
                     </pic:cNvPicPr>
                   </pic:nvPicPr>
-                  <pic:blipFill>
+                  <pic:blipFill rotWithShape="1">
                     <a:blip r:embed="rId8"/>
-                    <a:srcRect/>
+                    <a:srcRect b="6805"/>
                     <a:stretch>
                       <a:fillRect/>
                     </a:stretch>
@@ -1938,11 +2149,19 @@
                   <pic:spPr bwMode="auto">
                     <a:xfrm>
                       <a:off x="0" y="0"/>
-                      <a:ext cx="5022850" cy="3930650"/>
+                      <a:ext cx="5873750" cy="4000500"/>
                     </a:xfrm>
                     <a:prstGeom prst="rect">
                       <a:avLst/>
                     </a:prstGeom>
+                    <a:ln>
+                      <a:noFill/>
+                    </a:ln>
+                    <a:extLst>
+                      <a:ext uri="{53640926-AAD7-44D8-BBD7-CCE9431645EC}">
+                        <a14:shadowObscured xmlns:a14="http://schemas.microsoft.com/office/drawing/2010/main"/>
+                      </a:ext>
+                    </a:extLst>
                   </pic:spPr>
                 </pic:pic>
               </a:graphicData>
@@ -1950,25 +2169,36 @@
           </wp:inline>
         </w:drawing>
       </w:r>
+      <w:r>
+        <w:t xml:space="preserve"> </w:t>
+      </w:r>
     </w:p>
     <w:p>
       <w:pPr>
         <w:spacing w:before="120" w:after="300"/>
         <w:jc w:val="center"/>
-      </w:pPr>
-      <w:r>
-        <w:rPr>
+        <w:rPr>
+          <w:b/>
+          <w:bCs/>
+        </w:rPr>
+      </w:pPr>
+      <w:r>
+        <w:rPr>
+          <w:b/>
+          <w:bCs/>
           <w:i/>
           <w:iCs/>
           <w:color w:val="000000"/>
           <w:sz w:val="22"/>
           <w:szCs w:val="22"/>
         </w:rPr>
-        <w:t xml:space="preserve">Figure 2: </w:t>
+        <w:t xml:space="preserve">      Figure 2: </w:t>
       </w:r>
       <w:proofErr w:type="spellStart"/>
       <w:r>
         <w:rPr>
+          <w:b/>
+          <w:bCs/>
           <w:i/>
           <w:iCs/>
           <w:color w:val="000000"/>
@@ -1980,6 +2210,8 @@
       <w:proofErr w:type="spellEnd"/>
       <w:r>
         <w:rPr>
+          <w:b/>
+          <w:bCs/>
           <w:i/>
           <w:iCs/>
           <w:color w:val="000000"/>
@@ -1994,7 +2226,7 @@
         <w:pStyle w:val="ListParagraph"/>
         <w:numPr>
           <w:ilvl w:val="0"/>
-          <w:numId w:val="1"/>
+          <w:numId w:val="3"/>
         </w:numPr>
         <w:spacing w:after="120" w:line="300" w:lineRule="auto"/>
         <w:jc w:val="both"/>
@@ -2023,7 +2255,7 @@
         <w:pStyle w:val="ListParagraph"/>
         <w:numPr>
           <w:ilvl w:val="0"/>
-          <w:numId w:val="1"/>
+          <w:numId w:val="3"/>
         </w:numPr>
         <w:spacing w:after="120" w:line="300" w:lineRule="auto"/>
         <w:jc w:val="both"/>
@@ -2062,7 +2294,7 @@
           <w:sz w:val="24"/>
           <w:szCs w:val="24"/>
         </w:rPr>
-        <w:t xml:space="preserve"> (pauses graph), or end.</w:t>
+        <w:t xml:space="preserve"> (pauses the graph), or end.</w:t>
       </w:r>
     </w:p>
     <w:p>
@@ -2070,7 +2302,7 @@
         <w:pStyle w:val="ListParagraph"/>
         <w:numPr>
           <w:ilvl w:val="0"/>
-          <w:numId w:val="1"/>
+          <w:numId w:val="3"/>
         </w:numPr>
         <w:spacing w:after="120" w:line="300" w:lineRule="auto"/>
         <w:jc w:val="both"/>
@@ -2091,7 +2323,7 @@
           <w:sz w:val="24"/>
           <w:szCs w:val="24"/>
         </w:rPr>
-        <w:t xml:space="preserve"> / </w:t>
+        <w:t xml:space="preserve"> and </w:t>
       </w:r>
       <w:proofErr w:type="spellStart"/>
       <w:r>
@@ -2109,7 +2341,23 @@
           <w:sz w:val="24"/>
           <w:szCs w:val="24"/>
         </w:rPr>
-        <w:t>: not connected by graph edges — invoked directly by /notes/approve and /notes/revise, using the saved thread checkpoint.</w:t>
+        <w:t xml:space="preserve">: not connected by graph edges </w:t>
+      </w:r>
+      <w:r>
+        <w:rPr>
+          <w:color w:val="000000"/>
+          <w:sz w:val="24"/>
+          <w:szCs w:val="24"/>
+        </w:rPr>
+        <w:t xml:space="preserve">- </w:t>
+      </w:r>
+      <w:r>
+        <w:rPr>
+          <w:color w:val="000000"/>
+          <w:sz w:val="24"/>
+          <w:szCs w:val="24"/>
+        </w:rPr>
+        <w:t>invoked directly by /notes/approve and /notes/revise, using the saved thread checkpoint.</w:t>
       </w:r>
     </w:p>
     <w:p>
@@ -2125,6 +2373,7 @@
           <w:sz w:val="30"/>
           <w:szCs w:val="30"/>
         </w:rPr>
+        <w:lastRenderedPageBreak/>
         <w:t>8. Intent Classification and Tool Selection</w:t>
       </w:r>
     </w:p>
@@ -2139,7 +2388,39 @@
           <w:sz w:val="24"/>
           <w:szCs w:val="24"/>
         </w:rPr>
-        <w:t>Design decision: the LLM classifies intent as a label (JSON); backend code — not the LLM — picks and calls the tool. This is deliberate, not a limitation:</w:t>
+        <w:t xml:space="preserve">Design decision: the LLM classifies intent as a label (JSON); backend code </w:t>
+      </w:r>
+      <w:r>
+        <w:rPr>
+          <w:color w:val="000000"/>
+          <w:sz w:val="24"/>
+          <w:szCs w:val="24"/>
+        </w:rPr>
+        <w:t xml:space="preserve">- </w:t>
+      </w:r>
+      <w:r>
+        <w:rPr>
+          <w:color w:val="000000"/>
+          <w:sz w:val="24"/>
+          <w:szCs w:val="24"/>
+        </w:rPr>
+        <w:t xml:space="preserve">not the LLM </w:t>
+      </w:r>
+      <w:r>
+        <w:rPr>
+          <w:color w:val="000000"/>
+          <w:sz w:val="24"/>
+          <w:szCs w:val="24"/>
+        </w:rPr>
+        <w:t xml:space="preserve">- </w:t>
+      </w:r>
+      <w:r>
+        <w:rPr>
+          <w:color w:val="000000"/>
+          <w:sz w:val="24"/>
+          <w:szCs w:val="24"/>
+        </w:rPr>
+        <w:t>picks and calls the tool. This is deliberate, not a limitation:</w:t>
       </w:r>
     </w:p>
     <w:p>
@@ -2147,7 +2428,7 @@
         <w:pStyle w:val="ListParagraph"/>
         <w:numPr>
           <w:ilvl w:val="0"/>
-          <w:numId w:val="1"/>
+          <w:numId w:val="3"/>
         </w:numPr>
         <w:spacing w:after="120" w:line="300" w:lineRule="auto"/>
         <w:jc w:val="both"/>
@@ -2166,7 +2447,7 @@
         <w:pStyle w:val="ListParagraph"/>
         <w:numPr>
           <w:ilvl w:val="0"/>
-          <w:numId w:val="1"/>
+          <w:numId w:val="3"/>
         </w:numPr>
         <w:spacing w:after="120" w:line="300" w:lineRule="auto"/>
         <w:jc w:val="both"/>
@@ -2177,7 +2458,6 @@
           <w:sz w:val="24"/>
           <w:szCs w:val="24"/>
         </w:rPr>
-        <w:lastRenderedPageBreak/>
         <w:t xml:space="preserve">Trade-off: less flexible than a full </w:t>
       </w:r>
       <w:proofErr w:type="spellStart"/>
@@ -2196,7 +2476,23 @@
           <w:sz w:val="24"/>
           <w:szCs w:val="24"/>
         </w:rPr>
-        <w:t xml:space="preserve"> agent — can't improvise new tool combinations for unusual requests.</w:t>
+        <w:t xml:space="preserve"> agent </w:t>
+      </w:r>
+      <w:r>
+        <w:rPr>
+          <w:color w:val="000000"/>
+          <w:sz w:val="24"/>
+          <w:szCs w:val="24"/>
+        </w:rPr>
+        <w:t>-</w:t>
+      </w:r>
+      <w:r>
+        <w:rPr>
+          <w:color w:val="000000"/>
+          <w:sz w:val="24"/>
+          <w:szCs w:val="24"/>
+        </w:rPr>
+        <w:t xml:space="preserve"> it cannot improvise new tool combinations for unusual requests.</w:t>
       </w:r>
     </w:p>
     <w:p>
@@ -2204,7 +2500,7 @@
         <w:pStyle w:val="ListParagraph"/>
         <w:numPr>
           <w:ilvl w:val="0"/>
-          <w:numId w:val="1"/>
+          <w:numId w:val="3"/>
         </w:numPr>
         <w:spacing w:after="120" w:line="300" w:lineRule="auto"/>
         <w:jc w:val="both"/>
@@ -2233,7 +2529,7 @@
           <w:sz w:val="24"/>
           <w:szCs w:val="24"/>
         </w:rPr>
-        <w:t xml:space="preserve"> (notes/summary/quiz), </w:t>
+        <w:t xml:space="preserve"> (notes, summary, quiz), </w:t>
       </w:r>
       <w:proofErr w:type="spellStart"/>
       <w:r>
@@ -2277,7 +2573,7 @@
         <w:pStyle w:val="ListParagraph"/>
         <w:numPr>
           <w:ilvl w:val="0"/>
-          <w:numId w:val="1"/>
+          <w:numId w:val="3"/>
         </w:numPr>
         <w:spacing w:after="120" w:line="300" w:lineRule="auto"/>
         <w:jc w:val="both"/>
@@ -2330,7 +2626,7 @@
         <w:pStyle w:val="ListParagraph"/>
         <w:numPr>
           <w:ilvl w:val="0"/>
-          <w:numId w:val="1"/>
+          <w:numId w:val="3"/>
         </w:numPr>
         <w:spacing w:after="120" w:line="300" w:lineRule="auto"/>
         <w:jc w:val="both"/>
@@ -2341,7 +2637,7 @@
           <w:sz w:val="24"/>
           <w:szCs w:val="24"/>
         </w:rPr>
-        <w:t>Triggered by: notes, study, summary, guide, timeline, quiz, cheat-sheet keywords, or LLM classification.</w:t>
+        <w:t>Triggered by: notes, study, summary, guide, timeline, quiz, or cheat-sheet keywords, or by LLM classification.</w:t>
       </w:r>
     </w:p>
     <w:p>
@@ -2349,7 +2645,7 @@
         <w:pStyle w:val="ListParagraph"/>
         <w:numPr>
           <w:ilvl w:val="0"/>
-          <w:numId w:val="1"/>
+          <w:numId w:val="3"/>
         </w:numPr>
         <w:spacing w:after="120" w:line="300" w:lineRule="auto"/>
         <w:jc w:val="both"/>
@@ -2360,7 +2656,23 @@
           <w:sz w:val="24"/>
           <w:szCs w:val="24"/>
         </w:rPr>
-        <w:t>Samples 8 milestone chunks evenly spread across the full video (not the whole transcript) — keeps the prompt small.</w:t>
+        <w:t xml:space="preserve">Samples 8 milestone chunks evenly spread across the full video (not the whole transcript) </w:t>
+      </w:r>
+      <w:r>
+        <w:rPr>
+          <w:color w:val="000000"/>
+          <w:sz w:val="24"/>
+          <w:szCs w:val="24"/>
+        </w:rPr>
+        <w:t>-</w:t>
+      </w:r>
+      <w:r>
+        <w:rPr>
+          <w:color w:val="000000"/>
+          <w:sz w:val="24"/>
+          <w:szCs w:val="24"/>
+        </w:rPr>
+        <w:t xml:space="preserve"> keeps the prompt small.</w:t>
       </w:r>
     </w:p>
     <w:p>
@@ -2368,7 +2680,7 @@
         <w:pStyle w:val="ListParagraph"/>
         <w:numPr>
           <w:ilvl w:val="0"/>
-          <w:numId w:val="1"/>
+          <w:numId w:val="3"/>
         </w:numPr>
         <w:spacing w:after="120" w:line="300" w:lineRule="auto"/>
         <w:jc w:val="both"/>
@@ -2387,7 +2699,7 @@
         <w:pStyle w:val="ListParagraph"/>
         <w:numPr>
           <w:ilvl w:val="0"/>
-          <w:numId w:val="1"/>
+          <w:numId w:val="3"/>
         </w:numPr>
         <w:spacing w:after="120" w:line="300" w:lineRule="auto"/>
         <w:jc w:val="both"/>
@@ -2398,7 +2710,7 @@
           <w:sz w:val="24"/>
           <w:szCs w:val="24"/>
         </w:rPr>
-        <w:t>Fixed output structure: Executive Summary, Topic-by-Topic Breakdown (with real-world analogies), Architecture/Comparison Table, Key Takeaways &amp; Review Questions, Video Timeline with clickable links.</w:t>
+        <w:t>Fixed output structure: Executive Summary, Topic-by-Topic Breakdown (with real-world analogies), Architecture/Comparison Table, Key Takeaways and Review Questions, Video Timeline with clickable links.</w:t>
       </w:r>
     </w:p>
     <w:p>
@@ -2422,7 +2734,7 @@
         <w:pStyle w:val="ListParagraph"/>
         <w:numPr>
           <w:ilvl w:val="0"/>
-          <w:numId w:val="1"/>
+          <w:numId w:val="3"/>
         </w:numPr>
         <w:spacing w:after="120" w:line="300" w:lineRule="auto"/>
         <w:jc w:val="both"/>
@@ -2433,7 +2745,23 @@
           <w:sz w:val="24"/>
           <w:szCs w:val="24"/>
         </w:rPr>
-        <w:t xml:space="preserve">Generated notes are a draft, not final — </w:t>
+        <w:t xml:space="preserve">Generated notes are a draft, not final </w:t>
+      </w:r>
+      <w:r>
+        <w:rPr>
+          <w:color w:val="000000"/>
+          <w:sz w:val="24"/>
+          <w:szCs w:val="24"/>
+        </w:rPr>
+        <w:t>-</w:t>
+      </w:r>
+      <w:r>
+        <w:rPr>
+          <w:color w:val="000000"/>
+          <w:sz w:val="24"/>
+          <w:szCs w:val="24"/>
+        </w:rPr>
+        <w:t xml:space="preserve"> the </w:t>
       </w:r>
       <w:proofErr w:type="spellStart"/>
       <w:r>
@@ -2459,7 +2787,7 @@
         <w:pStyle w:val="ListParagraph"/>
         <w:numPr>
           <w:ilvl w:val="0"/>
-          <w:numId w:val="1"/>
+          <w:numId w:val="3"/>
         </w:numPr>
         <w:spacing w:after="120" w:line="300" w:lineRule="auto"/>
         <w:jc w:val="both"/>
@@ -2514,7 +2842,7 @@
         <w:pStyle w:val="ListParagraph"/>
         <w:numPr>
           <w:ilvl w:val="0"/>
-          <w:numId w:val="1"/>
+          <w:numId w:val="3"/>
         </w:numPr>
         <w:spacing w:after="120" w:line="300" w:lineRule="auto"/>
         <w:jc w:val="both"/>
@@ -2525,7 +2853,7 @@
           <w:sz w:val="24"/>
           <w:szCs w:val="24"/>
         </w:rPr>
-        <w:t>Student choice: Approve (POST /notes/approve) finalises the notes, or Request Changes (POST /notes/revise) sends feedback and draft back to the LLM.</w:t>
+        <w:t>Student choice: Approve (POST /notes/approve) finalises the notes, or Request Changes (POST /notes/revise) sends the feedback and draft back to the LLM.</w:t>
       </w:r>
     </w:p>
     <w:p>
@@ -2533,7 +2861,7 @@
         <w:pStyle w:val="ListParagraph"/>
         <w:numPr>
           <w:ilvl w:val="0"/>
-          <w:numId w:val="1"/>
+          <w:numId w:val="3"/>
         </w:numPr>
         <w:spacing w:after="120" w:line="300" w:lineRule="auto"/>
         <w:jc w:val="both"/>
@@ -2544,8 +2872,45 @@
           <w:sz w:val="24"/>
           <w:szCs w:val="24"/>
         </w:rPr>
-        <w:t>Revised notes require approval again — this can repeat until the student is satisfied.</w:t>
-      </w:r>
+        <w:t xml:space="preserve">Revised notes require approval again </w:t>
+      </w:r>
+      <w:r>
+        <w:rPr>
+          <w:color w:val="000000"/>
+          <w:sz w:val="24"/>
+          <w:szCs w:val="24"/>
+        </w:rPr>
+        <w:t>-</w:t>
+      </w:r>
+      <w:r>
+        <w:rPr>
+          <w:color w:val="000000"/>
+          <w:sz w:val="24"/>
+          <w:szCs w:val="24"/>
+        </w:rPr>
+        <w:t xml:space="preserve"> this can repeat until the student is satisfied.</w:t>
+      </w:r>
+    </w:p>
+    <w:p>
+      <w:pPr>
+        <w:pStyle w:val="ListParagraph"/>
+        <w:spacing w:after="120" w:line="300" w:lineRule="auto"/>
+        <w:ind w:left="720"/>
+        <w:jc w:val="both"/>
+        <w:rPr>
+          <w:color w:val="000000"/>
+          <w:sz w:val="24"/>
+          <w:szCs w:val="24"/>
+        </w:rPr>
+      </w:pPr>
+    </w:p>
+    <w:p>
+      <w:pPr>
+        <w:pStyle w:val="ListParagraph"/>
+        <w:spacing w:after="120" w:line="300" w:lineRule="auto"/>
+        <w:ind w:left="720"/>
+        <w:jc w:val="both"/>
+      </w:pPr>
     </w:p>
     <w:p>
       <w:pPr>
@@ -2560,6 +2925,7 @@
           <w:sz w:val="30"/>
           <w:szCs w:val="30"/>
         </w:rPr>
+        <w:lastRenderedPageBreak/>
         <w:t>11. Frontend Features</w:t>
       </w:r>
     </w:p>
@@ -2574,7 +2940,7 @@
           <w:sz w:val="24"/>
           <w:szCs w:val="24"/>
         </w:rPr>
-        <w:t>Built with React + Vite. Key features of the interface:</w:t>
+        <w:t>Built with React and Vite. Key features of the interface:</w:t>
       </w:r>
     </w:p>
     <w:p>
@@ -2582,7 +2948,7 @@
         <w:pStyle w:val="ListParagraph"/>
         <w:numPr>
           <w:ilvl w:val="0"/>
-          <w:numId w:val="1"/>
+          <w:numId w:val="3"/>
         </w:numPr>
         <w:spacing w:after="120" w:line="300" w:lineRule="auto"/>
         <w:jc w:val="both"/>
@@ -2593,7 +2959,23 @@
           <w:sz w:val="24"/>
           <w:szCs w:val="24"/>
         </w:rPr>
-        <w:t>Universal YouTube ingestion — one-click loading for standard, shortened (youtu.be), shorts, and embed URLs.</w:t>
+        <w:t xml:space="preserve">Universal YouTube ingestion </w:t>
+      </w:r>
+      <w:r>
+        <w:rPr>
+          <w:color w:val="000000"/>
+          <w:sz w:val="24"/>
+          <w:szCs w:val="24"/>
+        </w:rPr>
+        <w:t xml:space="preserve">- </w:t>
+      </w:r>
+      <w:r>
+        <w:rPr>
+          <w:color w:val="000000"/>
+          <w:sz w:val="24"/>
+          <w:szCs w:val="24"/>
+        </w:rPr>
+        <w:t>one-click loading for standard, shortened (youtu.be), shorts, and embed URLs.</w:t>
       </w:r>
     </w:p>
     <w:p>
@@ -2601,7 +2983,7 @@
         <w:pStyle w:val="ListParagraph"/>
         <w:numPr>
           <w:ilvl w:val="0"/>
-          <w:numId w:val="1"/>
+          <w:numId w:val="3"/>
         </w:numPr>
         <w:spacing w:after="120" w:line="300" w:lineRule="auto"/>
         <w:jc w:val="both"/>
@@ -2612,7 +2994,23 @@
           <w:sz w:val="24"/>
           <w:szCs w:val="24"/>
         </w:rPr>
-        <w:t>Three learning view modes — instant toggle between Study Notes, AI Tutor, and Split View.</w:t>
+        <w:t xml:space="preserve">Three learning view modes </w:t>
+      </w:r>
+      <w:r>
+        <w:rPr>
+          <w:color w:val="000000"/>
+          <w:sz w:val="24"/>
+          <w:szCs w:val="24"/>
+        </w:rPr>
+        <w:t xml:space="preserve">- </w:t>
+      </w:r>
+      <w:r>
+        <w:rPr>
+          <w:color w:val="000000"/>
+          <w:sz w:val="24"/>
+          <w:szCs w:val="24"/>
+        </w:rPr>
+        <w:t>instant toggle between Study Notes, AI Tutor, and Split View.</w:t>
       </w:r>
     </w:p>
     <w:p>
@@ -2620,7 +3018,7 @@
         <w:pStyle w:val="ListParagraph"/>
         <w:numPr>
           <w:ilvl w:val="0"/>
-          <w:numId w:val="1"/>
+          <w:numId w:val="3"/>
         </w:numPr>
         <w:spacing w:after="120" w:line="300" w:lineRule="auto"/>
         <w:jc w:val="both"/>
@@ -2631,8 +3029,23 @@
           <w:sz w:val="24"/>
           <w:szCs w:val="24"/>
         </w:rPr>
-        <w:lastRenderedPageBreak/>
-        <w:t xml:space="preserve">Interactive video player — embedded YouTube </w:t>
+        <w:t xml:space="preserve">Interactive video player </w:t>
+      </w:r>
+      <w:r>
+        <w:rPr>
+          <w:color w:val="000000"/>
+          <w:sz w:val="24"/>
+          <w:szCs w:val="24"/>
+        </w:rPr>
+        <w:t>-</w:t>
+      </w:r>
+      <w:r>
+        <w:rPr>
+          <w:color w:val="000000"/>
+          <w:sz w:val="24"/>
+          <w:szCs w:val="24"/>
+        </w:rPr>
+        <w:t xml:space="preserve"> embedded YouTube </w:t>
       </w:r>
       <w:proofErr w:type="spellStart"/>
       <w:r>
@@ -2658,7 +3071,7 @@
         <w:pStyle w:val="ListParagraph"/>
         <w:numPr>
           <w:ilvl w:val="0"/>
-          <w:numId w:val="1"/>
+          <w:numId w:val="3"/>
         </w:numPr>
         <w:spacing w:after="120" w:line="300" w:lineRule="auto"/>
         <w:jc w:val="both"/>
@@ -2669,7 +3082,23 @@
           <w:sz w:val="24"/>
           <w:szCs w:val="24"/>
         </w:rPr>
-        <w:t>AI Tutor Q&amp;A chat — natural language Q&amp;A with Markdown rendering, math/code syntax highlighting, and auto-scroll.</w:t>
+        <w:t xml:space="preserve">AI Tutor Q&amp;A chat </w:t>
+      </w:r>
+      <w:r>
+        <w:rPr>
+          <w:color w:val="000000"/>
+          <w:sz w:val="24"/>
+          <w:szCs w:val="24"/>
+        </w:rPr>
+        <w:t>-</w:t>
+      </w:r>
+      <w:r>
+        <w:rPr>
+          <w:color w:val="000000"/>
+          <w:sz w:val="24"/>
+          <w:szCs w:val="24"/>
+        </w:rPr>
+        <w:t xml:space="preserve"> natural language Q&amp;A with Markdown rendering, math and code syntax highlighting, and auto-scroll.</w:t>
       </w:r>
     </w:p>
     <w:p>
@@ -2677,7 +3106,7 @@
         <w:pStyle w:val="ListParagraph"/>
         <w:numPr>
           <w:ilvl w:val="0"/>
-          <w:numId w:val="1"/>
+          <w:numId w:val="3"/>
         </w:numPr>
         <w:spacing w:after="120" w:line="300" w:lineRule="auto"/>
         <w:jc w:val="both"/>
@@ -2688,7 +3117,23 @@
           <w:sz w:val="24"/>
           <w:szCs w:val="24"/>
         </w:rPr>
-        <w:t>One-click quick prompts — shortcut buttons for Create study notes, Key milestones, Summary, and Quiz.</w:t>
+        <w:t>One-click quick prompts</w:t>
+      </w:r>
+      <w:r>
+        <w:rPr>
+          <w:color w:val="000000"/>
+          <w:sz w:val="24"/>
+          <w:szCs w:val="24"/>
+        </w:rPr>
+        <w:t xml:space="preserve"> - </w:t>
+      </w:r>
+      <w:r>
+        <w:rPr>
+          <w:color w:val="000000"/>
+          <w:sz w:val="24"/>
+          <w:szCs w:val="24"/>
+        </w:rPr>
+        <w:t>shortcut buttons for Create study notes, Key milestones, Summary, and Quiz.</w:t>
       </w:r>
     </w:p>
     <w:p>
@@ -2696,7 +3141,7 @@
         <w:pStyle w:val="ListParagraph"/>
         <w:numPr>
           <w:ilvl w:val="0"/>
-          <w:numId w:val="1"/>
+          <w:numId w:val="3"/>
         </w:numPr>
         <w:spacing w:after="120" w:line="300" w:lineRule="auto"/>
         <w:jc w:val="both"/>
@@ -2707,7 +3152,23 @@
           <w:sz w:val="24"/>
           <w:szCs w:val="24"/>
         </w:rPr>
-        <w:t>Markdown study notes panel — formatted preview with an integrated live Markdown editor.</w:t>
+        <w:t xml:space="preserve">Markdown study notes panel </w:t>
+      </w:r>
+      <w:r>
+        <w:rPr>
+          <w:color w:val="000000"/>
+          <w:sz w:val="24"/>
+          <w:szCs w:val="24"/>
+        </w:rPr>
+        <w:t xml:space="preserve">- </w:t>
+      </w:r>
+      <w:r>
+        <w:rPr>
+          <w:color w:val="000000"/>
+          <w:sz w:val="24"/>
+          <w:szCs w:val="24"/>
+        </w:rPr>
+        <w:t>formatted preview with an integrated live Markdown editor.</w:t>
       </w:r>
     </w:p>
     <w:p>
@@ -2715,7 +3176,7 @@
         <w:pStyle w:val="ListParagraph"/>
         <w:numPr>
           <w:ilvl w:val="0"/>
-          <w:numId w:val="1"/>
+          <w:numId w:val="3"/>
         </w:numPr>
         <w:spacing w:after="120" w:line="300" w:lineRule="auto"/>
         <w:jc w:val="both"/>
@@ -2726,25 +3187,23 @@
           <w:sz w:val="24"/>
           <w:szCs w:val="24"/>
         </w:rPr>
-        <w:t xml:space="preserve">Copy and download — one-click clipboard </w:t>
-      </w:r>
-      <w:proofErr w:type="gramStart"/>
-      <w:r>
-        <w:rPr>
-          <w:color w:val="000000"/>
-          <w:sz w:val="24"/>
-          <w:szCs w:val="24"/>
-        </w:rPr>
-        <w:t>copy</w:t>
-      </w:r>
-      <w:proofErr w:type="gramEnd"/>
-      <w:r>
-        <w:rPr>
-          <w:color w:val="000000"/>
-          <w:sz w:val="24"/>
-          <w:szCs w:val="24"/>
-        </w:rPr>
-        <w:t xml:space="preserve"> and .md file download for offline study.</w:t>
+        <w:t xml:space="preserve">Copy and download </w:t>
+      </w:r>
+      <w:r>
+        <w:rPr>
+          <w:color w:val="000000"/>
+          <w:sz w:val="24"/>
+          <w:szCs w:val="24"/>
+        </w:rPr>
+        <w:t xml:space="preserve">- </w:t>
+      </w:r>
+      <w:r>
+        <w:rPr>
+          <w:color w:val="000000"/>
+          <w:sz w:val="24"/>
+          <w:szCs w:val="24"/>
+        </w:rPr>
+        <w:t>one-click clipboard copy and .md file download for offline study.</w:t>
       </w:r>
     </w:p>
     <w:p>
@@ -2752,7 +3211,7 @@
         <w:pStyle w:val="ListParagraph"/>
         <w:numPr>
           <w:ilvl w:val="0"/>
-          <w:numId w:val="1"/>
+          <w:numId w:val="3"/>
         </w:numPr>
         <w:spacing w:after="120" w:line="300" w:lineRule="auto"/>
         <w:jc w:val="both"/>
@@ -2763,7 +3222,23 @@
           <w:sz w:val="24"/>
           <w:szCs w:val="24"/>
         </w:rPr>
-        <w:t>Human-in-the-Loop approval — in-app banner to Approve or Revise AI-generated study notes.</w:t>
+        <w:t xml:space="preserve">Human-in-the-Loop approval </w:t>
+      </w:r>
+      <w:r>
+        <w:rPr>
+          <w:color w:val="000000"/>
+          <w:sz w:val="24"/>
+          <w:szCs w:val="24"/>
+        </w:rPr>
+        <w:t xml:space="preserve">- </w:t>
+      </w:r>
+      <w:r>
+        <w:rPr>
+          <w:color w:val="000000"/>
+          <w:sz w:val="24"/>
+          <w:szCs w:val="24"/>
+        </w:rPr>
+        <w:t>in-app banner to Approve or Revise AI-generated study notes.</w:t>
       </w:r>
     </w:p>
     <w:p>
@@ -2771,7 +3246,7 @@
         <w:pStyle w:val="ListParagraph"/>
         <w:numPr>
           <w:ilvl w:val="0"/>
-          <w:numId w:val="1"/>
+          <w:numId w:val="3"/>
         </w:numPr>
         <w:spacing w:after="120" w:line="300" w:lineRule="auto"/>
         <w:jc w:val="both"/>
@@ -2782,7 +3257,23 @@
           <w:sz w:val="24"/>
           <w:szCs w:val="24"/>
         </w:rPr>
-        <w:t>Note revision modal — popup dialog to enter natural language feedback to revise notes.</w:t>
+        <w:t xml:space="preserve">Note revision modal </w:t>
+      </w:r>
+      <w:r>
+        <w:rPr>
+          <w:color w:val="000000"/>
+          <w:sz w:val="24"/>
+          <w:szCs w:val="24"/>
+        </w:rPr>
+        <w:t>-</w:t>
+      </w:r>
+      <w:r>
+        <w:rPr>
+          <w:color w:val="000000"/>
+          <w:sz w:val="24"/>
+          <w:szCs w:val="24"/>
+        </w:rPr>
+        <w:t xml:space="preserve"> popup dialog to enter natural language feedback to revise notes.</w:t>
       </w:r>
     </w:p>
     <w:p>
@@ -2790,7 +3281,7 @@
         <w:pStyle w:val="ListParagraph"/>
         <w:numPr>
           <w:ilvl w:val="0"/>
-          <w:numId w:val="1"/>
+          <w:numId w:val="3"/>
         </w:numPr>
         <w:spacing w:after="120" w:line="300" w:lineRule="auto"/>
         <w:jc w:val="both"/>
@@ -2801,7 +3292,23 @@
           <w:sz w:val="24"/>
           <w:szCs w:val="24"/>
         </w:rPr>
-        <w:t>Draggable, resizable layout — customisable column widths and video player height.</w:t>
+        <w:t xml:space="preserve">Draggable, resizable layout </w:t>
+      </w:r>
+      <w:r>
+        <w:rPr>
+          <w:color w:val="000000"/>
+          <w:sz w:val="24"/>
+          <w:szCs w:val="24"/>
+        </w:rPr>
+        <w:t xml:space="preserve">- </w:t>
+      </w:r>
+      <w:r>
+        <w:rPr>
+          <w:color w:val="000000"/>
+          <w:sz w:val="24"/>
+          <w:szCs w:val="24"/>
+        </w:rPr>
+        <w:t>customisable column widths and video player height.</w:t>
       </w:r>
     </w:p>
     <w:p>
@@ -2817,7 +3324,267 @@
           <w:sz w:val="30"/>
           <w:szCs w:val="30"/>
         </w:rPr>
-        <w:t>12. API Endpoints</w:t>
+        <w:t>12. Observability and Telemetry</w:t>
+      </w:r>
+    </w:p>
+    <w:p>
+      <w:pPr>
+        <w:spacing w:after="200" w:line="300" w:lineRule="auto"/>
+        <w:jc w:val="both"/>
+      </w:pPr>
+      <w:r>
+        <w:rPr>
+          <w:color w:val="000000"/>
+          <w:sz w:val="24"/>
+          <w:szCs w:val="24"/>
+        </w:rPr>
+        <w:t>A custom, built-in observability subsystem tracks system reliability, safety, and performance without any external monitoring dependency.</w:t>
+      </w:r>
+    </w:p>
+    <w:p>
+      <w:pPr>
+        <w:pStyle w:val="ListParagraph"/>
+        <w:numPr>
+          <w:ilvl w:val="0"/>
+          <w:numId w:val="3"/>
+        </w:numPr>
+        <w:spacing w:after="120" w:line="300" w:lineRule="auto"/>
+        <w:jc w:val="both"/>
+      </w:pPr>
+      <w:r>
+        <w:rPr>
+          <w:color w:val="000000"/>
+          <w:sz w:val="24"/>
+          <w:szCs w:val="24"/>
+        </w:rPr>
+        <w:t xml:space="preserve">Real-time tracing </w:t>
+      </w:r>
+      <w:r>
+        <w:rPr>
+          <w:color w:val="000000"/>
+          <w:sz w:val="24"/>
+          <w:szCs w:val="24"/>
+        </w:rPr>
+        <w:t xml:space="preserve">- </w:t>
+      </w:r>
+      <w:r>
+        <w:rPr>
+          <w:color w:val="000000"/>
+          <w:sz w:val="24"/>
+          <w:szCs w:val="24"/>
+        </w:rPr>
+        <w:t xml:space="preserve">every conversation </w:t>
+      </w:r>
+      <w:proofErr w:type="gramStart"/>
+      <w:r>
+        <w:rPr>
+          <w:color w:val="000000"/>
+          <w:sz w:val="24"/>
+          <w:szCs w:val="24"/>
+        </w:rPr>
+        <w:t>turn</w:t>
+      </w:r>
+      <w:proofErr w:type="gramEnd"/>
+      <w:r>
+        <w:rPr>
+          <w:color w:val="000000"/>
+          <w:sz w:val="24"/>
+          <w:szCs w:val="24"/>
+        </w:rPr>
+        <w:t xml:space="preserve"> logs intent classification path, vector DB lookup latency, and total elapsed duration.</w:t>
+      </w:r>
+    </w:p>
+    <w:p>
+      <w:pPr>
+        <w:pStyle w:val="ListParagraph"/>
+        <w:numPr>
+          <w:ilvl w:val="0"/>
+          <w:numId w:val="3"/>
+        </w:numPr>
+        <w:spacing w:after="120" w:line="300" w:lineRule="auto"/>
+        <w:jc w:val="both"/>
+      </w:pPr>
+      <w:r>
+        <w:rPr>
+          <w:color w:val="000000"/>
+          <w:sz w:val="24"/>
+          <w:szCs w:val="24"/>
+        </w:rPr>
+        <w:t xml:space="preserve">LLM guardrails and safety </w:t>
+      </w:r>
+      <w:r>
+        <w:rPr>
+          <w:color w:val="000000"/>
+          <w:sz w:val="24"/>
+          <w:szCs w:val="24"/>
+        </w:rPr>
+        <w:t xml:space="preserve">- </w:t>
+      </w:r>
+      <w:r>
+        <w:rPr>
+          <w:color w:val="000000"/>
+          <w:sz w:val="24"/>
+          <w:szCs w:val="24"/>
+        </w:rPr>
+        <w:t>inputs and outputs are monitored to block prompt injections and harmful content.</w:t>
+      </w:r>
+    </w:p>
+    <w:p>
+      <w:pPr>
+        <w:pStyle w:val="ListParagraph"/>
+        <w:numPr>
+          <w:ilvl w:val="0"/>
+          <w:numId w:val="3"/>
+        </w:numPr>
+        <w:spacing w:after="120" w:line="300" w:lineRule="auto"/>
+        <w:jc w:val="both"/>
+      </w:pPr>
+      <w:r>
+        <w:rPr>
+          <w:color w:val="000000"/>
+          <w:sz w:val="24"/>
+          <w:szCs w:val="24"/>
+        </w:rPr>
+        <w:t xml:space="preserve">Quality evaluation scorecard </w:t>
+      </w:r>
+      <w:r>
+        <w:rPr>
+          <w:color w:val="000000"/>
+          <w:sz w:val="24"/>
+          <w:szCs w:val="24"/>
+        </w:rPr>
+        <w:t>-</w:t>
+      </w:r>
+      <w:r>
+        <w:rPr>
+          <w:color w:val="000000"/>
+          <w:sz w:val="24"/>
+          <w:szCs w:val="24"/>
+        </w:rPr>
+        <w:t xml:space="preserve"> responses are scored on faithfulness (</w:t>
+      </w:r>
+      <w:proofErr w:type="spellStart"/>
+      <w:r>
+        <w:rPr>
+          <w:color w:val="000000"/>
+          <w:sz w:val="24"/>
+          <w:szCs w:val="24"/>
+        </w:rPr>
+        <w:t>groundedness</w:t>
+      </w:r>
+      <w:proofErr w:type="spellEnd"/>
+      <w:r>
+        <w:rPr>
+          <w:color w:val="000000"/>
+          <w:sz w:val="24"/>
+          <w:szCs w:val="24"/>
+        </w:rPr>
+        <w:t xml:space="preserve"> to the video), prompt adherence, and relevance, flagging possible hallucinations. The evaluation engine uses Chain-of-Thought (</w:t>
+      </w:r>
+      <w:proofErr w:type="spellStart"/>
+      <w:r>
+        <w:rPr>
+          <w:color w:val="000000"/>
+          <w:sz w:val="24"/>
+          <w:szCs w:val="24"/>
+        </w:rPr>
+        <w:t>CoT</w:t>
+      </w:r>
+      <w:proofErr w:type="spellEnd"/>
+      <w:r>
+        <w:rPr>
+          <w:color w:val="000000"/>
+          <w:sz w:val="24"/>
+          <w:szCs w:val="24"/>
+        </w:rPr>
+        <w:t>) prompting to improve the accuracy of the LLM-as-a-judge scoring.</w:t>
+      </w:r>
+    </w:p>
+    <w:p>
+      <w:pPr>
+        <w:pStyle w:val="ListParagraph"/>
+        <w:numPr>
+          <w:ilvl w:val="0"/>
+          <w:numId w:val="3"/>
+        </w:numPr>
+        <w:spacing w:after="120" w:line="300" w:lineRule="auto"/>
+        <w:jc w:val="both"/>
+      </w:pPr>
+      <w:r>
+        <w:rPr>
+          <w:color w:val="000000"/>
+          <w:sz w:val="24"/>
+          <w:szCs w:val="24"/>
+        </w:rPr>
+        <w:t xml:space="preserve">Cost and token analytics </w:t>
+      </w:r>
+      <w:r>
+        <w:rPr>
+          <w:color w:val="000000"/>
+          <w:sz w:val="24"/>
+          <w:szCs w:val="24"/>
+        </w:rPr>
+        <w:t xml:space="preserve">- </w:t>
+      </w:r>
+      <w:r>
+        <w:rPr>
+          <w:color w:val="000000"/>
+          <w:sz w:val="24"/>
+          <w:szCs w:val="24"/>
+        </w:rPr>
+        <w:t>exact prompt and completion tokens per request, plus average and P95 latency, used to compute operational cost.</w:t>
+      </w:r>
+    </w:p>
+    <w:p>
+      <w:pPr>
+        <w:pStyle w:val="ListParagraph"/>
+        <w:numPr>
+          <w:ilvl w:val="0"/>
+          <w:numId w:val="3"/>
+        </w:numPr>
+        <w:spacing w:after="120" w:line="300" w:lineRule="auto"/>
+        <w:jc w:val="both"/>
+      </w:pPr>
+      <w:r>
+        <w:rPr>
+          <w:color w:val="000000"/>
+          <w:sz w:val="24"/>
+          <w:szCs w:val="24"/>
+        </w:rPr>
+        <w:lastRenderedPageBreak/>
+        <w:t xml:space="preserve">Observability dashboard </w:t>
+      </w:r>
+      <w:r>
+        <w:rPr>
+          <w:color w:val="000000"/>
+          <w:sz w:val="24"/>
+          <w:szCs w:val="24"/>
+        </w:rPr>
+        <w:t xml:space="preserve">- </w:t>
+      </w:r>
+      <w:r>
+        <w:rPr>
+          <w:color w:val="000000"/>
+          <w:sz w:val="24"/>
+          <w:szCs w:val="24"/>
+        </w:rPr>
+        <w:t>built into the frontend as an Observability View, showing trace logs, node transition graphs, and KPIs such as success rate and total trace count.</w:t>
+      </w:r>
+    </w:p>
+    <w:p>
+      <w:pPr>
+        <w:pStyle w:val="Heading1"/>
+        <w:spacing w:before="320" w:after="160"/>
+      </w:pPr>
+      <w:r>
+        <w:rPr>
+          <w:b/>
+          <w:bCs/>
+          <w:color w:val="000000"/>
+          <w:sz w:val="30"/>
+          <w:szCs w:val="30"/>
+        </w:rPr>
+        <w:t>13. API Endpoints</w:t>
       </w:r>
     </w:p>
     <w:tbl>
@@ -2846,16 +3613,19 @@
         <w:tc>
           <w:tcPr>
             <w:tcW w:w="1500" w:type="dxa"/>
-            <w:shd w:val="clear" w:color="auto" w:fill="D9D9D9"/>
-            <w:tcMar>
-              <w:top w:w="80" w:type="dxa"/>
-              <w:left w:w="100" w:type="dxa"/>
-              <w:bottom w:w="80" w:type="dxa"/>
-              <w:right w:w="100" w:type="dxa"/>
-            </w:tcMar>
-            <w:vAlign w:val="center"/>
-          </w:tcPr>
-          <w:p>
+            <w:shd w:val="clear" w:color="auto" w:fill="FFFFFF" w:themeFill="background1"/>
+            <w:tcMar>
+              <w:top w:w="80" w:type="dxa"/>
+              <w:left w:w="100" w:type="dxa"/>
+              <w:bottom w:w="80" w:type="dxa"/>
+              <w:right w:w="100" w:type="dxa"/>
+            </w:tcMar>
+            <w:vAlign w:val="center"/>
+          </w:tcPr>
+          <w:p>
+            <w:pPr>
+              <w:jc w:val="center"/>
+            </w:pPr>
             <w:r>
               <w:rPr>
                 <w:b/>
@@ -2869,16 +3639,19 @@
         <w:tc>
           <w:tcPr>
             <w:tcW w:w="2500" w:type="dxa"/>
-            <w:shd w:val="clear" w:color="auto" w:fill="D9D9D9"/>
-            <w:tcMar>
-              <w:top w:w="80" w:type="dxa"/>
-              <w:left w:w="100" w:type="dxa"/>
-              <w:bottom w:w="80" w:type="dxa"/>
-              <w:right w:w="100" w:type="dxa"/>
-            </w:tcMar>
-            <w:vAlign w:val="center"/>
-          </w:tcPr>
-          <w:p>
+            <w:shd w:val="clear" w:color="auto" w:fill="FFFFFF" w:themeFill="background1"/>
+            <w:tcMar>
+              <w:top w:w="80" w:type="dxa"/>
+              <w:left w:w="100" w:type="dxa"/>
+              <w:bottom w:w="80" w:type="dxa"/>
+              <w:right w:w="100" w:type="dxa"/>
+            </w:tcMar>
+            <w:vAlign w:val="center"/>
+          </w:tcPr>
+          <w:p>
+            <w:pPr>
+              <w:jc w:val="center"/>
+            </w:pPr>
             <w:r>
               <w:rPr>
                 <w:b/>
@@ -2892,16 +3665,19 @@
         <w:tc>
           <w:tcPr>
             <w:tcW w:w="5500" w:type="dxa"/>
-            <w:shd w:val="clear" w:color="auto" w:fill="D9D9D9"/>
-            <w:tcMar>
-              <w:top w:w="80" w:type="dxa"/>
-              <w:left w:w="100" w:type="dxa"/>
-              <w:bottom w:w="80" w:type="dxa"/>
-              <w:right w:w="100" w:type="dxa"/>
-            </w:tcMar>
-            <w:vAlign w:val="center"/>
-          </w:tcPr>
-          <w:p>
+            <w:shd w:val="clear" w:color="auto" w:fill="FFFFFF" w:themeFill="background1"/>
+            <w:tcMar>
+              <w:top w:w="80" w:type="dxa"/>
+              <w:left w:w="100" w:type="dxa"/>
+              <w:bottom w:w="80" w:type="dxa"/>
+              <w:right w:w="100" w:type="dxa"/>
+            </w:tcMar>
+            <w:vAlign w:val="center"/>
+          </w:tcPr>
+          <w:p>
+            <w:pPr>
+              <w:jc w:val="center"/>
+            </w:pPr>
             <w:r>
               <w:rPr>
                 <w:b/>
@@ -3267,7 +4043,7 @@
           <w:sz w:val="30"/>
           <w:szCs w:val="30"/>
         </w:rPr>
-        <w:t>13. Design Trade-offs Summary</w:t>
+        <w:t>14. Design Trade-offs Summary</w:t>
       </w:r>
     </w:p>
     <w:tbl>
@@ -3296,16 +4072,19 @@
         <w:tc>
           <w:tcPr>
             <w:tcW w:w="3300" w:type="dxa"/>
-            <w:shd w:val="clear" w:color="auto" w:fill="D9D9D9"/>
-            <w:tcMar>
-              <w:top w:w="80" w:type="dxa"/>
-              <w:left w:w="100" w:type="dxa"/>
-              <w:bottom w:w="80" w:type="dxa"/>
-              <w:right w:w="100" w:type="dxa"/>
-            </w:tcMar>
-            <w:vAlign w:val="center"/>
-          </w:tcPr>
-          <w:p>
+            <w:shd w:val="clear" w:color="auto" w:fill="FFFFFF" w:themeFill="background1"/>
+            <w:tcMar>
+              <w:top w:w="80" w:type="dxa"/>
+              <w:left w:w="100" w:type="dxa"/>
+              <w:bottom w:w="80" w:type="dxa"/>
+              <w:right w:w="100" w:type="dxa"/>
+            </w:tcMar>
+            <w:vAlign w:val="center"/>
+          </w:tcPr>
+          <w:p>
+            <w:pPr>
+              <w:jc w:val="center"/>
+            </w:pPr>
             <w:r>
               <w:rPr>
                 <w:b/>
@@ -3319,16 +4098,19 @@
         <w:tc>
           <w:tcPr>
             <w:tcW w:w="3300" w:type="dxa"/>
-            <w:shd w:val="clear" w:color="auto" w:fill="D9D9D9"/>
-            <w:tcMar>
-              <w:top w:w="80" w:type="dxa"/>
-              <w:left w:w="100" w:type="dxa"/>
-              <w:bottom w:w="80" w:type="dxa"/>
-              <w:right w:w="100" w:type="dxa"/>
-            </w:tcMar>
-            <w:vAlign w:val="center"/>
-          </w:tcPr>
-          <w:p>
+            <w:shd w:val="clear" w:color="auto" w:fill="FFFFFF" w:themeFill="background1"/>
+            <w:tcMar>
+              <w:top w:w="80" w:type="dxa"/>
+              <w:left w:w="100" w:type="dxa"/>
+              <w:bottom w:w="80" w:type="dxa"/>
+              <w:right w:w="100" w:type="dxa"/>
+            </w:tcMar>
+            <w:vAlign w:val="center"/>
+          </w:tcPr>
+          <w:p>
+            <w:pPr>
+              <w:jc w:val="center"/>
+            </w:pPr>
             <w:r>
               <w:rPr>
                 <w:b/>
@@ -3342,16 +4124,19 @@
         <w:tc>
           <w:tcPr>
             <w:tcW w:w="2900" w:type="dxa"/>
-            <w:shd w:val="clear" w:color="auto" w:fill="D9D9D9"/>
-            <w:tcMar>
-              <w:top w:w="80" w:type="dxa"/>
-              <w:left w:w="100" w:type="dxa"/>
-              <w:bottom w:w="80" w:type="dxa"/>
-              <w:right w:w="100" w:type="dxa"/>
-            </w:tcMar>
-            <w:vAlign w:val="center"/>
-          </w:tcPr>
-          <w:p>
+            <w:shd w:val="clear" w:color="auto" w:fill="FFFFFF" w:themeFill="background1"/>
+            <w:tcMar>
+              <w:top w:w="80" w:type="dxa"/>
+              <w:left w:w="100" w:type="dxa"/>
+              <w:bottom w:w="80" w:type="dxa"/>
+              <w:right w:w="100" w:type="dxa"/>
+            </w:tcMar>
+            <w:vAlign w:val="center"/>
+          </w:tcPr>
+          <w:p>
+            <w:pPr>
+              <w:jc w:val="center"/>
+            </w:pPr>
             <w:r>
               <w:rPr>
                 <w:b/>
@@ -3420,7 +4205,7 @@
               <w:rPr>
                 <w:color w:val="000000"/>
               </w:rPr>
-              <w:t>Less flexible for novel/compound requests</w:t>
+              <w:t>Less flexible for novel or compound requests</w:t>
             </w:r>
           </w:p>
         </w:tc>
@@ -3622,29 +4407,132 @@
     </w:tbl>
     <w:p>
       <w:pPr>
+        <w:spacing w:after="200" w:line="300" w:lineRule="auto"/>
+        <w:jc w:val="both"/>
+      </w:pPr>
+    </w:p>
+    <w:p>
+      <w:pPr>
+        <w:pStyle w:val="Heading1"/>
+        <w:spacing w:before="320" w:after="160"/>
+      </w:pPr>
+      <w:r>
+        <w:rPr>
+          <w:b/>
+          <w:bCs/>
+          <w:color w:val="000000"/>
+          <w:sz w:val="30"/>
+          <w:szCs w:val="30"/>
+        </w:rPr>
+        <w:t>15. Limitations and Future Work</w:t>
+      </w:r>
+    </w:p>
+    <w:p>
+      <w:pPr>
         <w:pStyle w:val="ListParagraph"/>
         <w:numPr>
           <w:ilvl w:val="0"/>
-          <w:numId w:val="2"/>
+          <w:numId w:val="3"/>
         </w:numPr>
-        <w:spacing w:after="200" w:line="300" w:lineRule="auto"/>
-        <w:jc w:val="both"/>
+        <w:spacing w:after="120" w:line="300" w:lineRule="auto"/>
+        <w:jc w:val="both"/>
+      </w:pPr>
+      <w:r>
+        <w:rPr>
+          <w:color w:val="000000"/>
+          <w:sz w:val="24"/>
+          <w:szCs w:val="24"/>
+        </w:rPr>
+        <w:t xml:space="preserve">8-chunk sampling may miss fine detail in very long lectures </w:t>
+      </w:r>
+      <w:r>
+        <w:rPr>
+          <w:color w:val="000000"/>
+          <w:sz w:val="24"/>
+          <w:szCs w:val="24"/>
+        </w:rPr>
+        <w:t xml:space="preserve">- </w:t>
+      </w:r>
+      <w:r>
+        <w:rPr>
+          <w:color w:val="000000"/>
+          <w:sz w:val="24"/>
+          <w:szCs w:val="24"/>
+        </w:rPr>
+        <w:t>a hierarchical summarisation approach could improve this.</w:t>
+      </w:r>
+    </w:p>
+    <w:p>
+      <w:pPr>
+        <w:pStyle w:val="ListParagraph"/>
+        <w:numPr>
+          <w:ilvl w:val="0"/>
+          <w:numId w:val="3"/>
+        </w:numPr>
+        <w:spacing w:after="120" w:line="300" w:lineRule="auto"/>
+        <w:jc w:val="both"/>
+      </w:pPr>
+      <w:r>
+        <w:rPr>
+          <w:color w:val="000000"/>
+          <w:sz w:val="24"/>
+          <w:szCs w:val="24"/>
+        </w:rPr>
+        <w:t>The fallback hash-based embedding is meaningfully less accurate than the primary model, and should be minimised in production.</w:t>
+      </w:r>
+    </w:p>
+    <w:p>
+      <w:pPr>
+        <w:pStyle w:val="ListParagraph"/>
+        <w:spacing w:after="120" w:line="300" w:lineRule="auto"/>
+        <w:ind w:left="720"/>
+        <w:jc w:val="both"/>
+        <w:rPr>
+          <w:color w:val="000000"/>
+          <w:sz w:val="24"/>
+          <w:szCs w:val="24"/>
+        </w:rPr>
+      </w:pPr>
+    </w:p>
+    <w:p>
+      <w:pPr>
+        <w:pStyle w:val="ListParagraph"/>
+        <w:spacing w:after="120" w:line="300" w:lineRule="auto"/>
+        <w:ind w:left="720"/>
+        <w:jc w:val="both"/>
+      </w:pPr>
+    </w:p>
+    <w:p>
+      <w:pPr>
+        <w:pStyle w:val="ListParagraph"/>
+        <w:spacing w:after="120" w:line="300" w:lineRule="auto"/>
+        <w:ind w:left="720"/>
+        <w:jc w:val="both"/>
+      </w:pPr>
+    </w:p>
+    <w:p>
+      <w:pPr>
+        <w:pStyle w:val="ListParagraph"/>
+        <w:spacing w:after="120" w:line="300" w:lineRule="auto"/>
+        <w:ind w:left="720"/>
+        <w:jc w:val="both"/>
+      </w:pPr>
+    </w:p>
+    <w:p>
+      <w:pPr>
+        <w:pStyle w:val="Heading1"/>
+        <w:spacing w:before="320" w:after="160"/>
+      </w:pPr>
+      <w:r>
         <w:rPr>
           <w:b/>
           <w:bCs/>
+          <w:color w:val="000000"/>
           <w:sz w:val="30"/>
           <w:szCs w:val="30"/>
         </w:rPr>
-      </w:pPr>
-      <w:r>
-        <w:rPr>
-          <w:b/>
-          <w:bCs/>
-          <w:sz w:val="30"/>
-          <w:szCs w:val="30"/>
-        </w:rPr>
         <w:lastRenderedPageBreak/>
-        <w:t>Output:</w:t>
+        <w:t>16. Conclusion</w:t>
       </w:r>
     </w:p>
     <w:p>
@@ -3652,206 +4540,6 @@
         <w:spacing w:after="200" w:line="300" w:lineRule="auto"/>
         <w:jc w:val="both"/>
       </w:pPr>
-      <w:r>
-        <w:drawing>
-          <wp:inline distT="0" distB="0" distL="0" distR="0" wp14:anchorId="4411EB5E" wp14:editId="43B77E0D">
-            <wp:extent cx="5943600" cy="3343275"/>
-            <wp:effectExtent l="0" t="0" r="0" b="9525"/>
-            <wp:docPr id="151360698" name="Picture 1"/>
-            <wp:cNvGraphicFramePr>
-              <a:graphicFrameLocks xmlns:a="http://schemas.openxmlformats.org/drawingml/2006/main" noChangeAspect="1"/>
-            </wp:cNvGraphicFramePr>
-            <a:graphic xmlns:a="http://schemas.openxmlformats.org/drawingml/2006/main">
-              <a:graphicData uri="http://schemas.openxmlformats.org/drawingml/2006/picture">
-                <pic:pic xmlns:pic="http://schemas.openxmlformats.org/drawingml/2006/picture">
-                  <pic:nvPicPr>
-                    <pic:cNvPr id="151360698" name=""/>
-                    <pic:cNvPicPr/>
-                  </pic:nvPicPr>
-                  <pic:blipFill>
-                    <a:blip r:embed="rId9"/>
-                    <a:stretch>
-                      <a:fillRect/>
-                    </a:stretch>
-                  </pic:blipFill>
-                  <pic:spPr>
-                    <a:xfrm>
-                      <a:off x="0" y="0"/>
-                      <a:ext cx="5943600" cy="3343275"/>
-                    </a:xfrm>
-                    <a:prstGeom prst="rect">
-                      <a:avLst/>
-                    </a:prstGeom>
-                  </pic:spPr>
-                </pic:pic>
-              </a:graphicData>
-            </a:graphic>
-          </wp:inline>
-        </w:drawing>
-      </w:r>
-    </w:p>
-    <w:p>
-      <w:pPr>
-        <w:spacing w:after="200" w:line="300" w:lineRule="auto"/>
-        <w:jc w:val="both"/>
-      </w:pPr>
-      <w:r>
-        <w:drawing>
-          <wp:inline distT="0" distB="0" distL="0" distR="0" wp14:anchorId="528147B9" wp14:editId="1BDCB9A4">
-            <wp:extent cx="5943600" cy="3343275"/>
-            <wp:effectExtent l="0" t="0" r="0" b="9525"/>
-            <wp:docPr id="1928543641" name="Picture 1"/>
-            <wp:cNvGraphicFramePr>
-              <a:graphicFrameLocks xmlns:a="http://schemas.openxmlformats.org/drawingml/2006/main" noChangeAspect="1"/>
-            </wp:cNvGraphicFramePr>
-            <a:graphic xmlns:a="http://schemas.openxmlformats.org/drawingml/2006/main">
-              <a:graphicData uri="http://schemas.openxmlformats.org/drawingml/2006/picture">
-                <pic:pic xmlns:pic="http://schemas.openxmlformats.org/drawingml/2006/picture">
-                  <pic:nvPicPr>
-                    <pic:cNvPr id="1928543641" name=""/>
-                    <pic:cNvPicPr/>
-                  </pic:nvPicPr>
-                  <pic:blipFill>
-                    <a:blip r:embed="rId10"/>
-                    <a:stretch>
-                      <a:fillRect/>
-                    </a:stretch>
-                  </pic:blipFill>
-                  <pic:spPr>
-                    <a:xfrm>
-                      <a:off x="0" y="0"/>
-                      <a:ext cx="5943600" cy="3343275"/>
-                    </a:xfrm>
-                    <a:prstGeom prst="rect">
-                      <a:avLst/>
-                    </a:prstGeom>
-                  </pic:spPr>
-                </pic:pic>
-              </a:graphicData>
-            </a:graphic>
-          </wp:inline>
-        </w:drawing>
-      </w:r>
-    </w:p>
-    <w:p>
-      <w:pPr>
-        <w:spacing w:after="200" w:line="300" w:lineRule="auto"/>
-        <w:jc w:val="both"/>
-      </w:pPr>
-      <w:r>
-        <w:lastRenderedPageBreak/>
-        <w:drawing>
-          <wp:inline distT="0" distB="0" distL="0" distR="0" wp14:anchorId="555D4C92" wp14:editId="548EBB69">
-            <wp:extent cx="5943600" cy="3343275"/>
-            <wp:effectExtent l="0" t="0" r="0" b="9525"/>
-            <wp:docPr id="2104827758" name="Picture 1"/>
-            <wp:cNvGraphicFramePr>
-              <a:graphicFrameLocks xmlns:a="http://schemas.openxmlformats.org/drawingml/2006/main" noChangeAspect="1"/>
-            </wp:cNvGraphicFramePr>
-            <a:graphic xmlns:a="http://schemas.openxmlformats.org/drawingml/2006/main">
-              <a:graphicData uri="http://schemas.openxmlformats.org/drawingml/2006/picture">
-                <pic:pic xmlns:pic="http://schemas.openxmlformats.org/drawingml/2006/picture">
-                  <pic:nvPicPr>
-                    <pic:cNvPr id="2104827758" name=""/>
-                    <pic:cNvPicPr/>
-                  </pic:nvPicPr>
-                  <pic:blipFill>
-                    <a:blip r:embed="rId11"/>
-                    <a:stretch>
-                      <a:fillRect/>
-                    </a:stretch>
-                  </pic:blipFill>
-                  <pic:spPr>
-                    <a:xfrm>
-                      <a:off x="0" y="0"/>
-                      <a:ext cx="5943600" cy="3343275"/>
-                    </a:xfrm>
-                    <a:prstGeom prst="rect">
-                      <a:avLst/>
-                    </a:prstGeom>
-                  </pic:spPr>
-                </pic:pic>
-              </a:graphicData>
-            </a:graphic>
-          </wp:inline>
-        </w:drawing>
-      </w:r>
-    </w:p>
-    <w:p>
-      <w:pPr>
-        <w:pStyle w:val="Heading1"/>
-        <w:spacing w:before="320" w:after="160"/>
-      </w:pPr>
-      <w:r>
-        <w:rPr>
-          <w:b/>
-          <w:bCs/>
-          <w:color w:val="000000"/>
-          <w:sz w:val="30"/>
-          <w:szCs w:val="30"/>
-        </w:rPr>
-        <w:t>14. Limitations and Future Work</w:t>
-      </w:r>
-    </w:p>
-    <w:p>
-      <w:pPr>
-        <w:pStyle w:val="ListParagraph"/>
-        <w:numPr>
-          <w:ilvl w:val="0"/>
-          <w:numId w:val="1"/>
-        </w:numPr>
-        <w:spacing w:after="120" w:line="300" w:lineRule="auto"/>
-        <w:jc w:val="both"/>
-      </w:pPr>
-      <w:r>
-        <w:rPr>
-          <w:color w:val="000000"/>
-          <w:sz w:val="24"/>
-          <w:szCs w:val="24"/>
-        </w:rPr>
-        <w:t>8-chunk sampling may miss fine detail in very long lectures — a hierarchical summarisation approach could improve this.</w:t>
-      </w:r>
-    </w:p>
-    <w:p>
-      <w:pPr>
-        <w:pStyle w:val="ListParagraph"/>
-        <w:numPr>
-          <w:ilvl w:val="0"/>
-          <w:numId w:val="1"/>
-        </w:numPr>
-        <w:spacing w:after="120" w:line="300" w:lineRule="auto"/>
-        <w:jc w:val="both"/>
-      </w:pPr>
-      <w:r>
-        <w:rPr>
-          <w:color w:val="000000"/>
-          <w:sz w:val="24"/>
-          <w:szCs w:val="24"/>
-        </w:rPr>
-        <w:t>Fallback hash-based embedding is meaningfully less accurate than the primary model — should be minimised in production.</w:t>
-      </w:r>
-    </w:p>
-    <w:p>
-      <w:pPr>
-        <w:pStyle w:val="Heading1"/>
-        <w:spacing w:before="320" w:after="160"/>
-      </w:pPr>
-      <w:r>
-        <w:rPr>
-          <w:b/>
-          <w:bCs/>
-          <w:color w:val="000000"/>
-          <w:sz w:val="30"/>
-          <w:szCs w:val="30"/>
-        </w:rPr>
-        <w:t>15. Conclusion</w:t>
-      </w:r>
-    </w:p>
-    <w:p>
-      <w:pPr>
-        <w:spacing w:after="200" w:line="300" w:lineRule="auto"/>
-        <w:jc w:val="both"/>
-      </w:pPr>
       <w:proofErr w:type="spellStart"/>
       <w:r>
         <w:rPr>
@@ -3886,13 +4574,28 @@
           <w:sz w:val="24"/>
           <w:szCs w:val="24"/>
         </w:rPr>
-        <w:t xml:space="preserve"> agent, and a Human-in-the-Loop review process to turn passive video-watching into grounded, interactive learning. Its design choices, including layered LLM fallback, deterministic tool routing, and per-video state isolation, prioritise reliability over unconstrained autonomy, while leaving a clear path to greater agentic flexibility as future work.</w:t>
-      </w:r>
+        <w:t xml:space="preserve"> agent, and a Human-in-the-Loop review process to turn passive video-watching into grounded, interactive learning. Its design choices layered LLM fallback, deterministic tool routing, and per-video state isolation prioritise reliability over unconstrained autonomy, while leaving a clear path to greater agentic flexibility as future work. The built-in observability subsystem adds transparency and safety by tracking and evaluating every operation the system performs.</w:t>
+      </w:r>
+    </w:p>
+    <w:p>
+      <w:pPr>
+        <w:spacing w:after="800"/>
+        <w:rPr>
+          <w:sz w:val="24"/>
+          <w:szCs w:val="24"/>
+        </w:rPr>
+      </w:pPr>
     </w:p>
     <w:sectPr>
-      <w:footerReference w:type="default" r:id="rId12"/>
+      <w:footerReference w:type="default" r:id="rId9"/>
       <w:pgSz w:w="12240" w:h="15840"/>
       <w:pgMar w:top="1440" w:right="1440" w:bottom="1440" w:left="1440" w:header="708" w:footer="708" w:gutter="0"/>
+      <w:pgBorders w:offsetFrom="page">
+        <w:top w:val="single" w:sz="4" w:space="24" w:color="auto"/>
+        <w:left w:val="single" w:sz="4" w:space="24" w:color="auto"/>
+        <w:bottom w:val="single" w:sz="4" w:space="24" w:color="auto"/>
+        <w:right w:val="single" w:sz="4" w:space="24" w:color="auto"/>
+      </w:pgBorders>
       <w:cols w:space="720"/>
       <w:docGrid w:linePitch="360"/>
     </w:sectPr>
@@ -3982,6 +4685,92 @@
 <file path=word/numbering.xml><?xml version="1.0" encoding="utf-8"?>
 <w:numbering xmlns:wpc="http://schemas.microsoft.com/office/word/2010/wordprocessingCanvas" xmlns:cx="http://schemas.microsoft.com/office/drawing/2014/chartex" xmlns:cx1="http://schemas.microsoft.com/office/drawing/2015/9/8/chartex" xmlns:cx2="http://schemas.microsoft.com/office/drawing/2015/10/21/chartex" xmlns:cx3="http://schemas.microsoft.com/office/drawing/2016/5/9/chartex" xmlns:cx4="http://schemas.microsoft.com/office/drawing/2016/5/10/chartex" xmlns:cx5="http://schemas.microsoft.com/office/drawing/2016/5/11/chartex" xmlns:cx6="http://schemas.microsoft.com/office/drawing/2016/5/12/chartex" xmlns:cx7="http://schemas.microsoft.com/office/drawing/2016/5/13/chartex" xmlns:cx8="http://schemas.microsoft.com/office/drawing/2016/5/14/chartex" xmlns:mc="http://schemas.openxmlformats.org/markup-compatibility/2006" xmlns:aink="http://schemas.microsoft.com/office/drawing/2016/ink" xmlns:am3d="http://schemas.microsoft.com/office/drawing/2017/model3d" xmlns:o="urn:schemas-microsoft-com:office:office" xmlns:oel="http://schemas.microsoft.com/office/2019/extlst" xmlns:r="http://schemas.openxmlformats.org/officeDocument/2006/relationships" xmlns:m="http://schemas.openxmlformats.org/officeDocument/2006/math" xmlns:v="urn:schemas-microsoft-com:vml" xmlns:wp14="http://schemas.microsoft.com/office/word/2010/wordprocessingDrawing" xmlns:wp="http://schemas.openxmlformats.org/drawingml/2006/wordprocessingDrawing" xmlns:w10="urn:schemas-microsoft-com:office:word" xmlns:w="http://schemas.openxmlformats.org/wordprocessingml/2006/main" xmlns:w14="http://schemas.microsoft.com/office/word/2010/wordml" xmlns:w15="http://schemas.microsoft.com/office/word/2012/wordml" xmlns:w16cex="http://schemas.microsoft.com/office/word/2018/wordml/cex" xmlns:w16cid="http://schemas.microsoft.com/office/word/2016/wordml/cid" xmlns:w16="http://schemas.microsoft.com/office/word/2018/wordml" xmlns:w16du="http://schemas.microsoft.com/office/word/2023/wordml/word16du" xmlns:w16sdtdh="http://schemas.microsoft.com/office/word/2020/wordml/sdtdatahash" xmlns:w16sdtfl="http://schemas.microsoft.com/office/word/2024/wordml/sdtformatlock" xmlns:w16se="http://schemas.microsoft.com/office/word/2015/wordml/symex" xmlns:wpg="http://schemas.microsoft.com/office/word/2010/wordprocessingGroup" xmlns:wpi="http://schemas.microsoft.com/office/word/2010/wordprocessingInk" xmlns:wne="http://schemas.microsoft.com/office/word/2006/wordml" xmlns:wps="http://schemas.microsoft.com/office/word/2010/wordprocessingShape" mc:Ignorable="w14 w15 w16se w16cid w16 w16cex w16sdtdh w16sdtfl w16du wp14">
   <w:abstractNum w:abstractNumId="0" w15:restartNumberingAfterBreak="0">
+    <w:nsid w:val="00EB5EEB"/>
+    <w:multiLevelType w:val="hybridMultilevel"/>
+    <w:tmpl w:val="649C0B5A"/>
+    <w:lvl w:ilvl="0" w:tplc="BB78935C">
+      <w:start w:val="1"/>
+      <w:numFmt w:val="bullet"/>
+      <w:lvlText w:val="●"/>
+      <w:lvlJc w:val="left"/>
+      <w:pPr>
+        <w:ind w:left="720" w:hanging="360"/>
+      </w:pPr>
+    </w:lvl>
+    <w:lvl w:ilvl="1" w:tplc="D018AFBA">
+      <w:start w:val="1"/>
+      <w:numFmt w:val="bullet"/>
+      <w:lvlText w:val="○"/>
+      <w:lvlJc w:val="left"/>
+      <w:pPr>
+        <w:ind w:left="1440" w:hanging="360"/>
+      </w:pPr>
+    </w:lvl>
+    <w:lvl w:ilvl="2" w:tplc="0BDEC474">
+      <w:start w:val="1"/>
+      <w:numFmt w:val="bullet"/>
+      <w:lvlText w:val="■"/>
+      <w:lvlJc w:val="left"/>
+      <w:pPr>
+        <w:ind w:left="2160" w:hanging="360"/>
+      </w:pPr>
+    </w:lvl>
+    <w:lvl w:ilvl="3" w:tplc="46964FF4">
+      <w:start w:val="1"/>
+      <w:numFmt w:val="bullet"/>
+      <w:lvlText w:val="●"/>
+      <w:lvlJc w:val="left"/>
+      <w:pPr>
+        <w:ind w:left="2880" w:hanging="360"/>
+      </w:pPr>
+    </w:lvl>
+    <w:lvl w:ilvl="4" w:tplc="B6682FAC">
+      <w:start w:val="1"/>
+      <w:numFmt w:val="bullet"/>
+      <w:lvlText w:val="○"/>
+      <w:lvlJc w:val="left"/>
+      <w:pPr>
+        <w:ind w:left="3600" w:hanging="360"/>
+      </w:pPr>
+    </w:lvl>
+    <w:lvl w:ilvl="5" w:tplc="4E0CB008">
+      <w:start w:val="1"/>
+      <w:numFmt w:val="bullet"/>
+      <w:lvlText w:val="■"/>
+      <w:lvlJc w:val="left"/>
+      <w:pPr>
+        <w:ind w:left="4320" w:hanging="360"/>
+      </w:pPr>
+    </w:lvl>
+    <w:lvl w:ilvl="6" w:tplc="B3F0783E">
+      <w:start w:val="1"/>
+      <w:numFmt w:val="bullet"/>
+      <w:lvlText w:val="●"/>
+      <w:lvlJc w:val="left"/>
+      <w:pPr>
+        <w:ind w:left="5040" w:hanging="360"/>
+      </w:pPr>
+    </w:lvl>
+    <w:lvl w:ilvl="7" w:tplc="59CEC52C">
+      <w:start w:val="1"/>
+      <w:numFmt w:val="bullet"/>
+      <w:lvlText w:val="●"/>
+      <w:lvlJc w:val="left"/>
+      <w:pPr>
+        <w:ind w:left="5760" w:hanging="360"/>
+      </w:pPr>
+    </w:lvl>
+    <w:lvl w:ilvl="8" w:tplc="A8764FD8">
+      <w:start w:val="1"/>
+      <w:numFmt w:val="bullet"/>
+      <w:lvlText w:val="●"/>
+      <w:lvlJc w:val="left"/>
+      <w:pPr>
+        <w:ind w:left="6480" w:hanging="360"/>
+      </w:pPr>
+    </w:lvl>
+  </w:abstractNum>
+  <w:abstractNum w:abstractNumId="1" w15:restartNumberingAfterBreak="0">
     <w:nsid w:val="06D723E2"/>
     <w:multiLevelType w:val="hybridMultilevel"/>
     <w:tmpl w:val="B3E4E6B4"/>
@@ -4067,7 +4856,7 @@
       </w:pPr>
     </w:lvl>
   </w:abstractNum>
-  <w:abstractNum w:abstractNumId="1" w15:restartNumberingAfterBreak="0">
+  <w:abstractNum w:abstractNumId="2" w15:restartNumberingAfterBreak="0">
     <w:nsid w:val="0D7562A6"/>
     <w:multiLevelType w:val="hybridMultilevel"/>
     <w:tmpl w:val="7A9C234A"/>
@@ -4181,13 +4970,19 @@
     </w:lvl>
   </w:abstractNum>
   <w:num w:numId="1" w16cid:durableId="939070167">
-    <w:abstractNumId w:val="0"/>
+    <w:abstractNumId w:val="1"/>
     <w:lvlOverride w:ilvl="0">
       <w:startOverride w:val="1"/>
     </w:lvlOverride>
   </w:num>
   <w:num w:numId="2" w16cid:durableId="1005596087">
-    <w:abstractNumId w:val="1"/>
+    <w:abstractNumId w:val="2"/>
+  </w:num>
+  <w:num w:numId="3" w16cid:durableId="1969511338">
+    <w:abstractNumId w:val="0"/>
+    <w:lvlOverride w:ilvl="0">
+      <w:startOverride w:val="1"/>
+    </w:lvlOverride>
   </w:num>
 </w:numbering>
 </file>
@@ -4587,6 +5382,7 @@
   </w:style>
   <w:style w:type="paragraph" w:styleId="Heading1">
     <w:name w:val="heading 1"/>
+    <w:link w:val="Heading1Char"/>
     <w:uiPriority w:val="9"/>
     <w:qFormat/>
     <w:pPr>
@@ -4821,6 +5617,18 @@
     <w:link w:val="Footer"/>
     <w:uiPriority w:val="99"/>
     <w:rsid w:val="003A1C97"/>
+  </w:style>
+  <w:style w:type="character" w:customStyle="1" w:styleId="Heading1Char">
+    <w:name w:val="Heading 1 Char"/>
+    <w:basedOn w:val="DefaultParagraphFont"/>
+    <w:link w:val="Heading1"/>
+    <w:uiPriority w:val="9"/>
+    <w:rsid w:val="0004265A"/>
+    <w:rPr>
+      <w:color w:val="2E74B5"/>
+      <w:sz w:val="32"/>
+      <w:szCs w:val="32"/>
+    </w:rPr>
   </w:style>
 </w:styles>
 </file>

</xml_diff>